<commit_message>
Move target value settings from user management to status sheets page
- Status sheets: inline target editing per operator with view/edit toggle
- Shows current values (or defaults in lighter color)
- Saves via PUT /api/admin/users/:id
- Removed target settings from user management edit form
- Analytics API: include target values in operator list response

Co-Authored-By: Claude Opus 4.6 (1M context) <noreply@anthropic.com>
</commit_message>
<xml_diff>
--- a/docs/オペレーター操作マニュアル.docx
+++ b/docs/オペレーター操作マニュアル.docx
@@ -520,21 +520,7 @@
         <w:rPr>
           <w:lang w:eastAsia="ja-JP"/>
         </w:rPr>
-        <w:t xml:space="preserve">このマニュアルは、AI </w:t>
-      </w:r>
-      <w:proofErr w:type="spellStart"/>
-      <w:r>
-        <w:rPr>
-          <w:lang w:eastAsia="ja-JP"/>
-        </w:rPr>
-        <w:t>CallCenter</w:t>
-      </w:r>
-      <w:proofErr w:type="spellEnd"/>
-      <w:r>
-        <w:rPr>
-          <w:lang w:eastAsia="ja-JP"/>
-        </w:rPr>
-        <w:t xml:space="preserve"> CRM Systemを使用するオペレーターの方を対象とした操作説明書です。日常業務で必要な操作手順をわかりやすく説明しています。</w:t>
+        <w:t>このマニュアルは、AI CallCenter CRM Systemを使用するオペレーターの方を対象とした操作説明書です。日常業務で必要な操作手順をわかりやすく説明しています。</w:t>
       </w:r>
     </w:p>
     <w:p>
@@ -664,21 +650,7 @@
         <w:rPr>
           <w:lang w:eastAsia="ja-JP"/>
         </w:rPr>
-        <w:t xml:space="preserve">AI </w:t>
-      </w:r>
-      <w:proofErr w:type="spellStart"/>
-      <w:r>
-        <w:rPr>
-          <w:lang w:eastAsia="ja-JP"/>
-        </w:rPr>
-        <w:t>CallCenter</w:t>
-      </w:r>
-      <w:proofErr w:type="spellEnd"/>
-      <w:r>
-        <w:rPr>
-          <w:lang w:eastAsia="ja-JP"/>
-        </w:rPr>
-        <w:t xml:space="preserve"> CRM Systemは、B2B向けコールセンター業務を支援するシステムです。外国人材派遣サービスの案内を目的とした企業への架電業務において、以下の機能を提供します：</w:t>
+        <w:t>AI CallCenter CRM Systemは、B2B向けコールセンター業務を支援するシステムです。外国人材派遣サービスの案内を目的とした企業への架電業務において、以下の機能を提供します：</w:t>
       </w:r>
     </w:p>
     <w:p>
@@ -1002,26 +974,77 @@
       <w:pPr>
         <w:ind w:left="567"/>
         <w:rPr>
-          <w:lang w:eastAsia="ja-JP"/>
-        </w:rPr>
-      </w:pPr>
-      <w:r>
-        <w:rPr>
-          <w:lang w:eastAsia="ja-JP"/>
-        </w:rPr>
-        <w:t xml:space="preserve">💡 </w:t>
-      </w:r>
-      <w:r>
-        <w:rPr>
           <w:color w:val="336699"/>
           <w:sz w:val="19"/>
           <w:lang w:eastAsia="ja-JP"/>
         </w:rPr>
+      </w:pPr>
+      <w:r>
+        <w:rPr>
+          <w:lang w:eastAsia="ja-JP"/>
+        </w:rPr>
+        <w:t xml:space="preserve">💡 </w:t>
+      </w:r>
+      <w:r>
+        <w:rPr>
+          <w:color w:val="336699"/>
+          <w:sz w:val="19"/>
+          <w:lang w:eastAsia="ja-JP"/>
+        </w:rPr>
         <w:t>メールアドレスの入力は不要です。名前の選択とパスワードの入力だけでログインできます。</w:t>
       </w:r>
     </w:p>
     <w:p>
       <w:pPr>
+        <w:ind w:left="567"/>
+        <w:rPr>
+          <w:rFonts w:hint="eastAsia"/>
+          <w:lang w:eastAsia="ja-JP"/>
+        </w:rPr>
+      </w:pPr>
+      <w:r>
+        <w:rPr>
+          <w:lang w:eastAsia="ja-JP"/>
+        </w:rPr>
+        <w:drawing>
+          <wp:inline distT="0" distB="0" distL="0" distR="0" wp14:anchorId="63330FB1" wp14:editId="0410F365">
+            <wp:extent cx="5760720" cy="3604895"/>
+            <wp:effectExtent l="0" t="0" r="0" b="0"/>
+            <wp:docPr id="1790373308" name="図 1"/>
+            <wp:cNvGraphicFramePr>
+              <a:graphicFrameLocks xmlns:a="http://schemas.openxmlformats.org/drawingml/2006/main" noChangeAspect="1"/>
+            </wp:cNvGraphicFramePr>
+            <a:graphic xmlns:a="http://schemas.openxmlformats.org/drawingml/2006/main">
+              <a:graphicData uri="http://schemas.openxmlformats.org/drawingml/2006/picture">
+                <pic:pic xmlns:pic="http://schemas.openxmlformats.org/drawingml/2006/picture">
+                  <pic:nvPicPr>
+                    <pic:cNvPr id="1790373308" name=""/>
+                    <pic:cNvPicPr/>
+                  </pic:nvPicPr>
+                  <pic:blipFill>
+                    <a:blip r:embed="rId8"/>
+                    <a:stretch>
+                      <a:fillRect/>
+                    </a:stretch>
+                  </pic:blipFill>
+                  <pic:spPr>
+                    <a:xfrm>
+                      <a:off x="0" y="0"/>
+                      <a:ext cx="5760720" cy="3604895"/>
+                    </a:xfrm>
+                    <a:prstGeom prst="rect">
+                      <a:avLst/>
+                    </a:prstGeom>
+                  </pic:spPr>
+                </pic:pic>
+              </a:graphicData>
+            </a:graphic>
+          </wp:inline>
+        </w:drawing>
+      </w:r>
+    </w:p>
+    <w:p>
+      <w:pPr>
         <w:pStyle w:val="21"/>
         <w:rPr>
           <w:lang w:eastAsia="ja-JP"/>
@@ -1078,6 +1101,7 @@
         <w:rPr>
           <w:lang w:eastAsia="ja-JP"/>
         </w:rPr>
+        <w:lastRenderedPageBreak/>
         <w:t>・パスワードに間違いがないか確認してください（大文字・小文字の区別に注意）。</w:t>
       </w:r>
     </w:p>
@@ -1144,6 +1168,54 @@
     </w:p>
     <w:p>
       <w:pPr>
+        <w:rPr>
+          <w:rFonts w:hint="eastAsia"/>
+          <w:lang w:eastAsia="ja-JP"/>
+        </w:rPr>
+      </w:pPr>
+      <w:r>
+        <w:rPr>
+          <w:lang w:eastAsia="ja-JP"/>
+        </w:rPr>
+        <w:drawing>
+          <wp:inline distT="0" distB="0" distL="0" distR="0" wp14:anchorId="0BDDE0B3" wp14:editId="0CD03866">
+            <wp:extent cx="5760720" cy="3209290"/>
+            <wp:effectExtent l="0" t="0" r="0" b="0"/>
+            <wp:docPr id="2014605974" name="図 1"/>
+            <wp:cNvGraphicFramePr>
+              <a:graphicFrameLocks xmlns:a="http://schemas.openxmlformats.org/drawingml/2006/main" noChangeAspect="1"/>
+            </wp:cNvGraphicFramePr>
+            <a:graphic xmlns:a="http://schemas.openxmlformats.org/drawingml/2006/main">
+              <a:graphicData uri="http://schemas.openxmlformats.org/drawingml/2006/picture">
+                <pic:pic xmlns:pic="http://schemas.openxmlformats.org/drawingml/2006/picture">
+                  <pic:nvPicPr>
+                    <pic:cNvPr id="2014605974" name=""/>
+                    <pic:cNvPicPr/>
+                  </pic:nvPicPr>
+                  <pic:blipFill>
+                    <a:blip r:embed="rId9"/>
+                    <a:stretch>
+                      <a:fillRect/>
+                    </a:stretch>
+                  </pic:blipFill>
+                  <pic:spPr>
+                    <a:xfrm>
+                      <a:off x="0" y="0"/>
+                      <a:ext cx="5760720" cy="3209290"/>
+                    </a:xfrm>
+                    <a:prstGeom prst="rect">
+                      <a:avLst/>
+                    </a:prstGeom>
+                  </pic:spPr>
+                </pic:pic>
+              </a:graphicData>
+            </a:graphic>
+          </wp:inline>
+        </w:drawing>
+      </w:r>
+    </w:p>
+    <w:p>
+      <w:pPr>
         <w:pStyle w:val="21"/>
         <w:rPr>
           <w:lang w:eastAsia="ja-JP"/>
@@ -1160,6 +1232,54 @@
           <w:lang w:eastAsia="ja-JP"/>
         </w:rPr>
         <w:t>指標の確認</w:t>
+      </w:r>
+    </w:p>
+    <w:p>
+      <w:pPr>
+        <w:rPr>
+          <w:rFonts w:hint="eastAsia"/>
+          <w:lang w:eastAsia="ja-JP"/>
+        </w:rPr>
+      </w:pPr>
+      <w:r>
+        <w:rPr>
+          <w:lang w:eastAsia="ja-JP"/>
+        </w:rPr>
+        <w:drawing>
+          <wp:inline distT="0" distB="0" distL="0" distR="0" wp14:anchorId="1818474A" wp14:editId="29AD2698">
+            <wp:extent cx="5760720" cy="1193800"/>
+            <wp:effectExtent l="0" t="0" r="0" b="6350"/>
+            <wp:docPr id="306672885" name="図 1"/>
+            <wp:cNvGraphicFramePr>
+              <a:graphicFrameLocks xmlns:a="http://schemas.openxmlformats.org/drawingml/2006/main" noChangeAspect="1"/>
+            </wp:cNvGraphicFramePr>
+            <a:graphic xmlns:a="http://schemas.openxmlformats.org/drawingml/2006/main">
+              <a:graphicData uri="http://schemas.openxmlformats.org/drawingml/2006/picture">
+                <pic:pic xmlns:pic="http://schemas.openxmlformats.org/drawingml/2006/picture">
+                  <pic:nvPicPr>
+                    <pic:cNvPr id="306672885" name=""/>
+                    <pic:cNvPicPr/>
+                  </pic:nvPicPr>
+                  <pic:blipFill>
+                    <a:blip r:embed="rId10"/>
+                    <a:stretch>
+                      <a:fillRect/>
+                    </a:stretch>
+                  </pic:blipFill>
+                  <pic:spPr>
+                    <a:xfrm>
+                      <a:off x="0" y="0"/>
+                      <a:ext cx="5760720" cy="1193800"/>
+                    </a:xfrm>
+                    <a:prstGeom prst="rect">
+                      <a:avLst/>
+                    </a:prstGeom>
+                  </pic:spPr>
+                </pic:pic>
+              </a:graphicData>
+            </a:graphic>
+          </wp:inline>
+        </w:drawing>
       </w:r>
     </w:p>
     <w:p>
@@ -1199,7 +1319,6 @@
             <w:pPr>
               <w:jc w:val="center"/>
             </w:pPr>
-            <w:proofErr w:type="spellStart"/>
             <w:r>
               <w:rPr>
                 <w:b/>
@@ -1208,7 +1327,6 @@
               </w:rPr>
               <w:t>指標名</w:t>
             </w:r>
-            <w:proofErr w:type="spellEnd"/>
           </w:p>
         </w:tc>
         <w:tc>
@@ -1342,14 +1460,12 @@
             <w:shd w:val="clear" w:color="auto" w:fill="F0F4FA"/>
           </w:tcPr>
           <w:p>
-            <w:proofErr w:type="spellStart"/>
             <w:r>
               <w:rPr>
                 <w:sz w:val="19"/>
               </w:rPr>
               <w:t>リコール消化</w:t>
             </w:r>
-            <w:proofErr w:type="spellEnd"/>
           </w:p>
         </w:tc>
         <w:tc>
@@ -1382,14 +1498,13 @@
             <w:tcW w:w="2268" w:type="dxa"/>
           </w:tcPr>
           <w:p>
-            <w:proofErr w:type="spellStart"/>
             <w:r>
               <w:rPr>
                 <w:sz w:val="19"/>
               </w:rPr>
+              <w:lastRenderedPageBreak/>
               <w:t>有効接続</w:t>
             </w:r>
-            <w:proofErr w:type="spellEnd"/>
           </w:p>
         </w:tc>
         <w:tc>
@@ -1555,7 +1670,6 @@
             <w:pPr>
               <w:jc w:val="center"/>
             </w:pPr>
-            <w:proofErr w:type="spellStart"/>
             <w:r>
               <w:rPr>
                 <w:b/>
@@ -1564,7 +1678,6 @@
               </w:rPr>
               <w:t>タブ名</w:t>
             </w:r>
-            <w:proofErr w:type="spellEnd"/>
           </w:p>
         </w:tc>
         <w:tc>
@@ -1634,14 +1747,12 @@
             <w:shd w:val="clear" w:color="auto" w:fill="F0F4FA"/>
           </w:tcPr>
           <w:p>
-            <w:proofErr w:type="spellStart"/>
             <w:r>
               <w:rPr>
                 <w:sz w:val="19"/>
               </w:rPr>
               <w:t>週別</w:t>
             </w:r>
-            <w:proofErr w:type="spellEnd"/>
           </w:p>
         </w:tc>
         <w:tc>
@@ -1674,14 +1785,12 @@
             <w:tcW w:w="1701" w:type="dxa"/>
           </w:tcPr>
           <w:p>
-            <w:proofErr w:type="spellStart"/>
             <w:r>
               <w:rPr>
                 <w:sz w:val="19"/>
               </w:rPr>
               <w:t>月別</w:t>
             </w:r>
-            <w:proofErr w:type="spellEnd"/>
           </w:p>
         </w:tc>
         <w:tc>
@@ -1714,14 +1823,12 @@
             <w:shd w:val="clear" w:color="auto" w:fill="F0F4FA"/>
           </w:tcPr>
           <w:p>
-            <w:proofErr w:type="spellStart"/>
             <w:r>
               <w:rPr>
                 <w:sz w:val="19"/>
               </w:rPr>
               <w:t>累計</w:t>
             </w:r>
-            <w:proofErr w:type="spellEnd"/>
           </w:p>
         </w:tc>
         <w:tc>
@@ -1791,98 +1898,147 @@
           <w:b/>
           <w:lang w:eastAsia="ja-JP"/>
         </w:rPr>
+        <w:t xml:space="preserve">1. </w:t>
+      </w:r>
+      <w:r>
+        <w:rPr>
+          <w:lang w:eastAsia="ja-JP"/>
+        </w:rPr>
+        <w:t>稼働時間の欄にある「クリックして入力」をクリックしてください。</w:t>
+      </w:r>
+    </w:p>
+    <w:p>
+      <w:pPr>
+        <w:ind w:left="567"/>
+        <w:rPr>
+          <w:lang w:eastAsia="ja-JP"/>
+        </w:rPr>
+      </w:pPr>
+      <w:r>
+        <w:rPr>
+          <w:b/>
+          <w:lang w:eastAsia="ja-JP"/>
+        </w:rPr>
+        <w:t xml:space="preserve">2. </w:t>
+      </w:r>
+      <w:r>
+        <w:rPr>
+          <w:lang w:eastAsia="ja-JP"/>
+        </w:rPr>
+        <w:t>入力画面が表示されます。以下の項目を入力してください：</w:t>
+      </w:r>
+    </w:p>
+    <w:p>
+      <w:pPr>
+        <w:ind w:left="850" w:hanging="283"/>
+        <w:rPr>
+          <w:lang w:eastAsia="ja-JP"/>
+        </w:rPr>
+      </w:pPr>
+      <w:r>
+        <w:rPr>
+          <w:lang w:eastAsia="ja-JP"/>
+        </w:rPr>
+        <w:t>・開始時刻（例：9:00）</w:t>
+      </w:r>
+    </w:p>
+    <w:p>
+      <w:pPr>
+        <w:ind w:left="850" w:hanging="283"/>
+        <w:rPr>
+          <w:lang w:eastAsia="ja-JP"/>
+        </w:rPr>
+      </w:pPr>
+      <w:r>
+        <w:rPr>
+          <w:lang w:eastAsia="ja-JP"/>
+        </w:rPr>
+        <w:t>・終了時刻（例：18:00）</w:t>
+      </w:r>
+    </w:p>
+    <w:p>
+      <w:pPr>
+        <w:ind w:left="850" w:hanging="283"/>
+        <w:rPr>
+          <w:lang w:eastAsia="ja-JP"/>
+        </w:rPr>
+      </w:pPr>
+      <w:r>
+        <w:rPr>
+          <w:lang w:eastAsia="ja-JP"/>
+        </w:rPr>
+        <w:t>・休憩時間（分単位、例：60）</w:t>
+      </w:r>
+    </w:p>
+    <w:p>
+      <w:pPr>
+        <w:ind w:left="567"/>
+        <w:rPr>
+          <w:lang w:eastAsia="ja-JP"/>
+        </w:rPr>
+      </w:pPr>
+      <w:r>
+        <w:rPr>
+          <w:b/>
+          <w:lang w:eastAsia="ja-JP"/>
+        </w:rPr>
+        <w:t xml:space="preserve">3. </w:t>
+      </w:r>
+      <w:r>
+        <w:rPr>
+          <w:lang w:eastAsia="ja-JP"/>
+        </w:rPr>
+        <w:t>入力したら保存してください。稼働時間が自動計算されます。</w:t>
+      </w:r>
+    </w:p>
+    <w:p>
+      <w:pPr>
+        <w:ind w:left="567"/>
+        <w:rPr>
+          <w:rFonts w:hint="eastAsia"/>
+          <w:lang w:eastAsia="ja-JP"/>
+        </w:rPr>
+      </w:pPr>
+      <w:r>
+        <w:rPr>
+          <w:lang w:eastAsia="ja-JP"/>
+        </w:rPr>
         <w:lastRenderedPageBreak/>
-        <w:t xml:space="preserve">1. </w:t>
-      </w:r>
-      <w:r>
-        <w:rPr>
-          <w:lang w:eastAsia="ja-JP"/>
-        </w:rPr>
-        <w:t>稼働時間の欄にある「クリックして入力」をクリックしてください。</w:t>
-      </w:r>
-    </w:p>
-    <w:p>
-      <w:pPr>
-        <w:ind w:left="567"/>
-        <w:rPr>
-          <w:lang w:eastAsia="ja-JP"/>
-        </w:rPr>
-      </w:pPr>
-      <w:r>
-        <w:rPr>
-          <w:b/>
-          <w:lang w:eastAsia="ja-JP"/>
-        </w:rPr>
-        <w:t xml:space="preserve">2. </w:t>
-      </w:r>
-      <w:r>
-        <w:rPr>
-          <w:lang w:eastAsia="ja-JP"/>
-        </w:rPr>
-        <w:t>入力画面が表示されます。以下の項目を入力してください：</w:t>
-      </w:r>
-    </w:p>
-    <w:p>
-      <w:pPr>
-        <w:ind w:left="850" w:hanging="283"/>
-        <w:rPr>
-          <w:lang w:eastAsia="ja-JP"/>
-        </w:rPr>
-      </w:pPr>
-      <w:r>
-        <w:rPr>
-          <w:lang w:eastAsia="ja-JP"/>
-        </w:rPr>
-        <w:t>・開始時刻（例：9:00）</w:t>
-      </w:r>
-    </w:p>
-    <w:p>
-      <w:pPr>
-        <w:ind w:left="850" w:hanging="283"/>
-        <w:rPr>
-          <w:lang w:eastAsia="ja-JP"/>
-        </w:rPr>
-      </w:pPr>
-      <w:r>
-        <w:rPr>
-          <w:lang w:eastAsia="ja-JP"/>
-        </w:rPr>
-        <w:t>・終了時刻（例：18:00）</w:t>
-      </w:r>
-    </w:p>
-    <w:p>
-      <w:pPr>
-        <w:ind w:left="850" w:hanging="283"/>
-        <w:rPr>
-          <w:lang w:eastAsia="ja-JP"/>
-        </w:rPr>
-      </w:pPr>
-      <w:r>
-        <w:rPr>
-          <w:lang w:eastAsia="ja-JP"/>
-        </w:rPr>
-        <w:t>・休憩時間（分単位、例：60）</w:t>
-      </w:r>
-    </w:p>
-    <w:p>
-      <w:pPr>
-        <w:ind w:left="567"/>
-        <w:rPr>
-          <w:lang w:eastAsia="ja-JP"/>
-        </w:rPr>
-      </w:pPr>
-      <w:r>
-        <w:rPr>
-          <w:b/>
-          <w:lang w:eastAsia="ja-JP"/>
-        </w:rPr>
-        <w:t xml:space="preserve">3. </w:t>
-      </w:r>
-      <w:r>
-        <w:rPr>
-          <w:lang w:eastAsia="ja-JP"/>
-        </w:rPr>
-        <w:t>入力したら保存してください。稼働時間が自動計算されます。</w:t>
+        <w:drawing>
+          <wp:inline distT="0" distB="0" distL="0" distR="0" wp14:anchorId="4E76A502" wp14:editId="419010EE">
+            <wp:extent cx="5760720" cy="4248785"/>
+            <wp:effectExtent l="0" t="0" r="0" b="0"/>
+            <wp:docPr id="439356871" name="図 1"/>
+            <wp:cNvGraphicFramePr>
+              <a:graphicFrameLocks xmlns:a="http://schemas.openxmlformats.org/drawingml/2006/main" noChangeAspect="1"/>
+            </wp:cNvGraphicFramePr>
+            <a:graphic xmlns:a="http://schemas.openxmlformats.org/drawingml/2006/main">
+              <a:graphicData uri="http://schemas.openxmlformats.org/drawingml/2006/picture">
+                <pic:pic xmlns:pic="http://schemas.openxmlformats.org/drawingml/2006/picture">
+                  <pic:nvPicPr>
+                    <pic:cNvPr id="439356871" name=""/>
+                    <pic:cNvPicPr/>
+                  </pic:nvPicPr>
+                  <pic:blipFill>
+                    <a:blip r:embed="rId11"/>
+                    <a:stretch>
+                      <a:fillRect/>
+                    </a:stretch>
+                  </pic:blipFill>
+                  <pic:spPr>
+                    <a:xfrm>
+                      <a:off x="0" y="0"/>
+                      <a:ext cx="5760720" cy="4248785"/>
+                    </a:xfrm>
+                    <a:prstGeom prst="rect">
+                      <a:avLst/>
+                    </a:prstGeom>
+                  </pic:spPr>
+                </pic:pic>
+              </a:graphicData>
+            </a:graphic>
+          </wp:inline>
+        </w:drawing>
       </w:r>
     </w:p>
     <w:p>
@@ -1942,7 +2098,6 @@
             <w:pPr>
               <w:jc w:val="center"/>
             </w:pPr>
-            <w:proofErr w:type="spellStart"/>
             <w:r>
               <w:rPr>
                 <w:b/>
@@ -1951,7 +2106,6 @@
               </w:rPr>
               <w:t>ボタン名</w:t>
             </w:r>
-            <w:proofErr w:type="spellEnd"/>
           </w:p>
         </w:tc>
         <w:tc>
@@ -2036,19 +2190,11 @@
             <w:shd w:val="clear" w:color="auto" w:fill="F0F4FA"/>
           </w:tcPr>
           <w:p>
-            <w:proofErr w:type="spellStart"/>
             <w:r>
               <w:rPr>
                 <w:sz w:val="19"/>
               </w:rPr>
-              <w:t>日報コピ</w:t>
-            </w:r>
-            <w:proofErr w:type="spellEnd"/>
-            <w:r>
-              <w:rPr>
-                <w:sz w:val="19"/>
-              </w:rPr>
-              <w:t>ー</w:t>
+              <w:t>日報コピー</w:t>
             </w:r>
           </w:p>
         </w:tc>
@@ -2078,123 +2224,159 @@
       <w:pPr>
         <w:ind w:left="567"/>
         <w:rPr>
-          <w:lang w:eastAsia="ja-JP"/>
-        </w:rPr>
-      </w:pPr>
-      <w:r>
-        <w:rPr>
-          <w:lang w:eastAsia="ja-JP"/>
-        </w:rPr>
-        <w:t xml:space="preserve">💡 </w:t>
-      </w:r>
-      <w:r>
-        <w:rPr>
           <w:color w:val="336699"/>
           <w:sz w:val="19"/>
           <w:lang w:eastAsia="ja-JP"/>
         </w:rPr>
-        <w:t>コピーしたデータは、チャットツール等にそのまま貼り付け（</w:t>
-      </w:r>
-      <w:proofErr w:type="spellStart"/>
+      </w:pPr>
+      <w:r>
+        <w:rPr>
+          <w:lang w:eastAsia="ja-JP"/>
+        </w:rPr>
+        <w:t xml:space="preserve">💡 </w:t>
+      </w:r>
       <w:r>
         <w:rPr>
           <w:color w:val="336699"/>
           <w:sz w:val="19"/>
           <w:lang w:eastAsia="ja-JP"/>
         </w:rPr>
-        <w:t>Ctrl+V</w:t>
-      </w:r>
-      <w:proofErr w:type="spellEnd"/>
-      <w:r>
+        <w:t>コピーしたデータは、チャットツール等にそのまま貼り付け（Ctrl+V）できます。</w:t>
+      </w:r>
+    </w:p>
+    <w:p>
+      <w:pPr>
+        <w:ind w:left="567"/>
+        <w:rPr>
+          <w:rFonts w:hint="eastAsia"/>
+          <w:lang w:eastAsia="ja-JP"/>
+        </w:rPr>
+      </w:pPr>
+      <w:r>
+        <w:rPr>
+          <w:lang w:eastAsia="ja-JP"/>
+        </w:rPr>
+        <w:drawing>
+          <wp:inline distT="0" distB="0" distL="0" distR="0" wp14:anchorId="0EF766F6" wp14:editId="44359327">
+            <wp:extent cx="3486637" cy="733527"/>
+            <wp:effectExtent l="0" t="0" r="0" b="9525"/>
+            <wp:docPr id="411532706" name="図 1"/>
+            <wp:cNvGraphicFramePr>
+              <a:graphicFrameLocks xmlns:a="http://schemas.openxmlformats.org/drawingml/2006/main" noChangeAspect="1"/>
+            </wp:cNvGraphicFramePr>
+            <a:graphic xmlns:a="http://schemas.openxmlformats.org/drawingml/2006/main">
+              <a:graphicData uri="http://schemas.openxmlformats.org/drawingml/2006/picture">
+                <pic:pic xmlns:pic="http://schemas.openxmlformats.org/drawingml/2006/picture">
+                  <pic:nvPicPr>
+                    <pic:cNvPr id="411532706" name=""/>
+                    <pic:cNvPicPr/>
+                  </pic:nvPicPr>
+                  <pic:blipFill>
+                    <a:blip r:embed="rId12"/>
+                    <a:stretch>
+                      <a:fillRect/>
+                    </a:stretch>
+                  </pic:blipFill>
+                  <pic:spPr>
+                    <a:xfrm>
+                      <a:off x="0" y="0"/>
+                      <a:ext cx="3486637" cy="733527"/>
+                    </a:xfrm>
+                    <a:prstGeom prst="rect">
+                      <a:avLst/>
+                    </a:prstGeom>
+                  </pic:spPr>
+                </pic:pic>
+              </a:graphicData>
+            </a:graphic>
+          </wp:inline>
+        </w:drawing>
+      </w:r>
+    </w:p>
+    <w:p>
+      <w:pPr>
+        <w:pStyle w:val="21"/>
+        <w:rPr>
+          <w:lang w:eastAsia="ja-JP"/>
+        </w:rPr>
+      </w:pPr>
+      <w:r>
+        <w:rPr>
+          <w:lang w:eastAsia="ja-JP"/>
+        </w:rPr>
+        <w:lastRenderedPageBreak/>
+        <w:t xml:space="preserve">3.5 </w:t>
+      </w:r>
+      <w:r>
+        <w:rPr>
+          <w:lang w:eastAsia="ja-JP"/>
+        </w:rPr>
+        <w:t>グラフの確認</w:t>
+      </w:r>
+    </w:p>
+    <w:p>
+      <w:pPr>
+        <w:rPr>
+          <w:lang w:eastAsia="ja-JP"/>
+        </w:rPr>
+      </w:pPr>
+      <w:r>
+        <w:rPr>
+          <w:lang w:eastAsia="ja-JP"/>
+        </w:rPr>
+        <w:t>画面下部に以下のグラフが表示されます：</w:t>
+      </w:r>
+    </w:p>
+    <w:p>
+      <w:pPr>
+        <w:ind w:left="567" w:hanging="283"/>
+        <w:rPr>
+          <w:lang w:eastAsia="ja-JP"/>
+        </w:rPr>
+      </w:pPr>
+      <w:r>
+        <w:rPr>
+          <w:lang w:eastAsia="ja-JP"/>
+        </w:rPr>
+        <w:t>・時間帯別コール数：時間帯ごとの架電数を棒グラフで表示</w:t>
+      </w:r>
+    </w:p>
+    <w:p>
+      <w:pPr>
+        <w:ind w:left="567" w:hanging="283"/>
+        <w:rPr>
+          <w:lang w:eastAsia="ja-JP"/>
+        </w:rPr>
+      </w:pPr>
+      <w:r>
+        <w:rPr>
+          <w:lang w:eastAsia="ja-JP"/>
+        </w:rPr>
+        <w:t>・業種別転換率：業種ごとの案件化率を表示</w:t>
+      </w:r>
+    </w:p>
+    <w:p>
+      <w:pPr>
+        <w:ind w:left="567" w:hanging="283"/>
+        <w:rPr>
+          <w:lang w:eastAsia="ja-JP"/>
+        </w:rPr>
+      </w:pPr>
+      <w:r>
+        <w:rPr>
+          <w:lang w:eastAsia="ja-JP"/>
+        </w:rPr>
+        <w:t>・時間帯×業種別接続率：時間帯と業種の組み合わせで接続率を表示</w:t>
+      </w:r>
+    </w:p>
+    <w:p>
+      <w:pPr>
+        <w:ind w:left="567"/>
         <w:rPr>
           <w:color w:val="336699"/>
           <w:sz w:val="19"/>
           <w:lang w:eastAsia="ja-JP"/>
         </w:rPr>
-        <w:t>）できます。</w:t>
-      </w:r>
-    </w:p>
-    <w:p>
-      <w:pPr>
-        <w:pStyle w:val="21"/>
-        <w:rPr>
-          <w:lang w:eastAsia="ja-JP"/>
-        </w:rPr>
-      </w:pPr>
-      <w:r>
-        <w:rPr>
-          <w:lang w:eastAsia="ja-JP"/>
-        </w:rPr>
-        <w:t xml:space="preserve">3.5 </w:t>
-      </w:r>
-      <w:r>
-        <w:rPr>
-          <w:lang w:eastAsia="ja-JP"/>
-        </w:rPr>
-        <w:t>グラフの確認</w:t>
-      </w:r>
-    </w:p>
-    <w:p>
-      <w:pPr>
-        <w:rPr>
-          <w:lang w:eastAsia="ja-JP"/>
-        </w:rPr>
-      </w:pPr>
-      <w:r>
-        <w:rPr>
-          <w:lang w:eastAsia="ja-JP"/>
-        </w:rPr>
-        <w:t>画面下部に以下のグラフが表示されます：</w:t>
-      </w:r>
-    </w:p>
-    <w:p>
-      <w:pPr>
-        <w:ind w:left="567" w:hanging="283"/>
-        <w:rPr>
-          <w:lang w:eastAsia="ja-JP"/>
-        </w:rPr>
-      </w:pPr>
-      <w:r>
-        <w:rPr>
-          <w:lang w:eastAsia="ja-JP"/>
-        </w:rPr>
-        <w:t>・時間帯別コール数：時間帯ごとの架電数を棒グラフで表示</w:t>
-      </w:r>
-    </w:p>
-    <w:p>
-      <w:pPr>
-        <w:ind w:left="567" w:hanging="283"/>
-        <w:rPr>
-          <w:lang w:eastAsia="ja-JP"/>
-        </w:rPr>
-      </w:pPr>
-      <w:r>
-        <w:rPr>
-          <w:lang w:eastAsia="ja-JP"/>
-        </w:rPr>
-        <w:t>・業種別転換率：業種ごとの案件化率を表示</w:t>
-      </w:r>
-    </w:p>
-    <w:p>
-      <w:pPr>
-        <w:ind w:left="567" w:hanging="283"/>
-        <w:rPr>
-          <w:lang w:eastAsia="ja-JP"/>
-        </w:rPr>
-      </w:pPr>
-      <w:r>
-        <w:rPr>
-          <w:lang w:eastAsia="ja-JP"/>
-        </w:rPr>
-        <w:t>・時間帯×業種別接続率：時間帯と業種の組み合わせで接続率を表示</w:t>
-      </w:r>
-    </w:p>
-    <w:p>
-      <w:pPr>
-        <w:ind w:left="567"/>
-        <w:rPr>
-          <w:lang w:eastAsia="ja-JP"/>
-        </w:rPr>
       </w:pPr>
       <w:r>
         <w:rPr>
@@ -2213,6 +2395,55 @@
     </w:p>
     <w:p>
       <w:pPr>
+        <w:ind w:left="567"/>
+        <w:rPr>
+          <w:rFonts w:hint="eastAsia"/>
+          <w:lang w:eastAsia="ja-JP"/>
+        </w:rPr>
+      </w:pPr>
+      <w:r>
+        <w:rPr>
+          <w:lang w:eastAsia="ja-JP"/>
+        </w:rPr>
+        <w:drawing>
+          <wp:inline distT="0" distB="0" distL="0" distR="0" wp14:anchorId="0497AADF" wp14:editId="08643C7D">
+            <wp:extent cx="5760720" cy="4537710"/>
+            <wp:effectExtent l="0" t="0" r="0" b="0"/>
+            <wp:docPr id="302632700" name="図 1"/>
+            <wp:cNvGraphicFramePr>
+              <a:graphicFrameLocks xmlns:a="http://schemas.openxmlformats.org/drawingml/2006/main" noChangeAspect="1"/>
+            </wp:cNvGraphicFramePr>
+            <a:graphic xmlns:a="http://schemas.openxmlformats.org/drawingml/2006/main">
+              <a:graphicData uri="http://schemas.openxmlformats.org/drawingml/2006/picture">
+                <pic:pic xmlns:pic="http://schemas.openxmlformats.org/drawingml/2006/picture">
+                  <pic:nvPicPr>
+                    <pic:cNvPr id="302632700" name=""/>
+                    <pic:cNvPicPr/>
+                  </pic:nvPicPr>
+                  <pic:blipFill>
+                    <a:blip r:embed="rId13"/>
+                    <a:stretch>
+                      <a:fillRect/>
+                    </a:stretch>
+                  </pic:blipFill>
+                  <pic:spPr>
+                    <a:xfrm>
+                      <a:off x="0" y="0"/>
+                      <a:ext cx="5760720" cy="4537710"/>
+                    </a:xfrm>
+                    <a:prstGeom prst="rect">
+                      <a:avLst/>
+                    </a:prstGeom>
+                  </pic:spPr>
+                </pic:pic>
+              </a:graphicData>
+            </a:graphic>
+          </wp:inline>
+        </w:drawing>
+      </w:r>
+    </w:p>
+    <w:p>
+      <w:pPr>
         <w:rPr>
           <w:lang w:eastAsia="ja-JP"/>
         </w:rPr>
@@ -2321,6 +2552,55 @@
     </w:p>
     <w:p>
       <w:pPr>
+        <w:ind w:left="567" w:hanging="283"/>
+        <w:rPr>
+          <w:rFonts w:hint="eastAsia"/>
+          <w:lang w:eastAsia="ja-JP"/>
+        </w:rPr>
+      </w:pPr>
+      <w:r>
+        <w:rPr>
+          <w:lang w:eastAsia="ja-JP"/>
+        </w:rPr>
+        <w:drawing>
+          <wp:inline distT="0" distB="0" distL="0" distR="0" wp14:anchorId="563E3541" wp14:editId="514B17A8">
+            <wp:extent cx="5760720" cy="3186430"/>
+            <wp:effectExtent l="0" t="0" r="0" b="0"/>
+            <wp:docPr id="669671461" name="図 1"/>
+            <wp:cNvGraphicFramePr>
+              <a:graphicFrameLocks xmlns:a="http://schemas.openxmlformats.org/drawingml/2006/main" noChangeAspect="1"/>
+            </wp:cNvGraphicFramePr>
+            <a:graphic xmlns:a="http://schemas.openxmlformats.org/drawingml/2006/main">
+              <a:graphicData uri="http://schemas.openxmlformats.org/drawingml/2006/picture">
+                <pic:pic xmlns:pic="http://schemas.openxmlformats.org/drawingml/2006/picture">
+                  <pic:nvPicPr>
+                    <pic:cNvPr id="669671461" name=""/>
+                    <pic:cNvPicPr/>
+                  </pic:nvPicPr>
+                  <pic:blipFill>
+                    <a:blip r:embed="rId14"/>
+                    <a:stretch>
+                      <a:fillRect/>
+                    </a:stretch>
+                  </pic:blipFill>
+                  <pic:spPr>
+                    <a:xfrm>
+                      <a:off x="0" y="0"/>
+                      <a:ext cx="5760720" cy="3186430"/>
+                    </a:xfrm>
+                    <a:prstGeom prst="rect">
+                      <a:avLst/>
+                    </a:prstGeom>
+                  </pic:spPr>
+                </pic:pic>
+              </a:graphicData>
+            </a:graphic>
+          </wp:inline>
+        </w:drawing>
+      </w:r>
+    </w:p>
+    <w:p>
+      <w:pPr>
         <w:pStyle w:val="21"/>
         <w:rPr>
           <w:lang w:eastAsia="ja-JP"/>
@@ -2330,6 +2610,7 @@
         <w:rPr>
           <w:lang w:eastAsia="ja-JP"/>
         </w:rPr>
+        <w:lastRenderedPageBreak/>
         <w:t xml:space="preserve">4.2 </w:t>
       </w:r>
       <w:r>
@@ -2337,6 +2618,54 @@
           <w:lang w:eastAsia="ja-JP"/>
         </w:rPr>
         <w:t>ピックアップモード</w:t>
+      </w:r>
+    </w:p>
+    <w:p>
+      <w:pPr>
+        <w:rPr>
+          <w:rFonts w:hint="eastAsia"/>
+          <w:lang w:eastAsia="ja-JP"/>
+        </w:rPr>
+      </w:pPr>
+      <w:r>
+        <w:rPr>
+          <w:lang w:eastAsia="ja-JP"/>
+        </w:rPr>
+        <w:drawing>
+          <wp:inline distT="0" distB="0" distL="0" distR="0" wp14:anchorId="6692FCA7" wp14:editId="2FF37A25">
+            <wp:extent cx="2295845" cy="2867425"/>
+            <wp:effectExtent l="0" t="0" r="9525" b="9525"/>
+            <wp:docPr id="1929897487" name="図 1"/>
+            <wp:cNvGraphicFramePr>
+              <a:graphicFrameLocks xmlns:a="http://schemas.openxmlformats.org/drawingml/2006/main" noChangeAspect="1"/>
+            </wp:cNvGraphicFramePr>
+            <a:graphic xmlns:a="http://schemas.openxmlformats.org/drawingml/2006/main">
+              <a:graphicData uri="http://schemas.openxmlformats.org/drawingml/2006/picture">
+                <pic:pic xmlns:pic="http://schemas.openxmlformats.org/drawingml/2006/picture">
+                  <pic:nvPicPr>
+                    <pic:cNvPr id="1929897487" name=""/>
+                    <pic:cNvPicPr/>
+                  </pic:nvPicPr>
+                  <pic:blipFill>
+                    <a:blip r:embed="rId15"/>
+                    <a:stretch>
+                      <a:fillRect/>
+                    </a:stretch>
+                  </pic:blipFill>
+                  <pic:spPr>
+                    <a:xfrm>
+                      <a:off x="0" y="0"/>
+                      <a:ext cx="2295845" cy="2867425"/>
+                    </a:xfrm>
+                    <a:prstGeom prst="rect">
+                      <a:avLst/>
+                    </a:prstGeom>
+                  </pic:spPr>
+                </pic:pic>
+              </a:graphicData>
+            </a:graphic>
+          </wp:inline>
+        </w:drawing>
       </w:r>
     </w:p>
     <w:p>
@@ -2376,7 +2705,6 @@
             <w:pPr>
               <w:jc w:val="center"/>
             </w:pPr>
-            <w:proofErr w:type="spellStart"/>
             <w:r>
               <w:rPr>
                 <w:b/>
@@ -2385,7 +2713,6 @@
               </w:rPr>
               <w:t>タブ名</w:t>
             </w:r>
-            <w:proofErr w:type="spellEnd"/>
           </w:p>
         </w:tc>
         <w:tc>
@@ -2455,14 +2782,12 @@
             <w:shd w:val="clear" w:color="auto" w:fill="F0F4FA"/>
           </w:tcPr>
           <w:p>
-            <w:proofErr w:type="spellStart"/>
             <w:r>
               <w:rPr>
                 <w:sz w:val="19"/>
               </w:rPr>
               <w:t>業種別</w:t>
             </w:r>
-            <w:proofErr w:type="spellEnd"/>
           </w:p>
         </w:tc>
         <w:tc>
@@ -2495,14 +2820,12 @@
             <w:tcW w:w="1701" w:type="dxa"/>
           </w:tcPr>
           <w:p>
-            <w:proofErr w:type="spellStart"/>
             <w:r>
               <w:rPr>
                 <w:sz w:val="19"/>
               </w:rPr>
               <w:t>自作</w:t>
             </w:r>
-            <w:proofErr w:type="spellEnd"/>
           </w:p>
         </w:tc>
         <w:tc>
@@ -2535,14 +2858,12 @@
             <w:shd w:val="clear" w:color="auto" w:fill="F0F4FA"/>
           </w:tcPr>
           <w:p>
-            <w:proofErr w:type="spellStart"/>
             <w:r>
               <w:rPr>
                 <w:sz w:val="19"/>
               </w:rPr>
               <w:t>特別</w:t>
             </w:r>
-            <w:proofErr w:type="spellEnd"/>
           </w:p>
         </w:tc>
         <w:tc>
@@ -2652,6 +2973,56 @@
     </w:p>
     <w:p>
       <w:pPr>
+        <w:ind w:left="567"/>
+        <w:rPr>
+          <w:rFonts w:hint="eastAsia"/>
+          <w:lang w:eastAsia="ja-JP"/>
+        </w:rPr>
+      </w:pPr>
+      <w:r>
+        <w:rPr>
+          <w:lang w:eastAsia="ja-JP"/>
+        </w:rPr>
+        <w:lastRenderedPageBreak/>
+        <w:drawing>
+          <wp:inline distT="0" distB="0" distL="0" distR="0" wp14:anchorId="082F167F" wp14:editId="117EB3C5">
+            <wp:extent cx="2610214" cy="4839375"/>
+            <wp:effectExtent l="0" t="0" r="0" b="0"/>
+            <wp:docPr id="2012443854" name="図 1"/>
+            <wp:cNvGraphicFramePr>
+              <a:graphicFrameLocks xmlns:a="http://schemas.openxmlformats.org/drawingml/2006/main" noChangeAspect="1"/>
+            </wp:cNvGraphicFramePr>
+            <a:graphic xmlns:a="http://schemas.openxmlformats.org/drawingml/2006/main">
+              <a:graphicData uri="http://schemas.openxmlformats.org/drawingml/2006/picture">
+                <pic:pic xmlns:pic="http://schemas.openxmlformats.org/drawingml/2006/picture">
+                  <pic:nvPicPr>
+                    <pic:cNvPr id="2012443854" name=""/>
+                    <pic:cNvPicPr/>
+                  </pic:nvPicPr>
+                  <pic:blipFill>
+                    <a:blip r:embed="rId16"/>
+                    <a:stretch>
+                      <a:fillRect/>
+                    </a:stretch>
+                  </pic:blipFill>
+                  <pic:spPr>
+                    <a:xfrm>
+                      <a:off x="0" y="0"/>
+                      <a:ext cx="2610214" cy="4839375"/>
+                    </a:xfrm>
+                    <a:prstGeom prst="rect">
+                      <a:avLst/>
+                    </a:prstGeom>
+                  </pic:spPr>
+                </pic:pic>
+              </a:graphicData>
+            </a:graphic>
+          </wp:inline>
+        </w:drawing>
+      </w:r>
+    </w:p>
+    <w:p>
+      <w:pPr>
         <w:pStyle w:val="21"/>
         <w:rPr>
           <w:lang w:eastAsia="ja-JP"/>
@@ -2716,36 +3087,131 @@
           <w:b/>
           <w:lang w:eastAsia="ja-JP"/>
         </w:rPr>
+        <w:t xml:space="preserve">2. </w:t>
+      </w:r>
+      <w:r>
+        <w:rPr>
+          <w:lang w:eastAsia="ja-JP"/>
+        </w:rPr>
+        <w:t>「架電開始」（緑色のボタン）をクリックしてください。</w:t>
+      </w:r>
+      <w:r>
+        <w:rPr>
+          <w:rFonts w:hint="eastAsia"/>
+          <w:lang w:eastAsia="ja-JP"/>
+        </w:rPr>
+        <w:t>ZoomPhoneへの自動架電</w:t>
+      </w:r>
+      <w:r>
+        <w:rPr>
+          <w:lang w:eastAsia="ja-JP"/>
+        </w:rPr>
+        <w:t>が開始します。</w:t>
+      </w:r>
+    </w:p>
+    <w:p>
+      <w:pPr>
+        <w:ind w:left="567"/>
+        <w:rPr>
+          <w:lang w:eastAsia="ja-JP"/>
+        </w:rPr>
+      </w:pPr>
+      <w:r>
+        <w:rPr>
+          <w:b/>
+          <w:lang w:eastAsia="ja-JP"/>
+        </w:rPr>
+        <w:t xml:space="preserve">3. </w:t>
+      </w:r>
+      <w:r>
+        <w:rPr>
+          <w:lang w:eastAsia="ja-JP"/>
+        </w:rPr>
+        <w:t>電話をかけてください。</w:t>
+      </w:r>
+    </w:p>
+    <w:p>
+      <w:pPr>
+        <w:ind w:left="567"/>
+        <w:rPr>
+          <w:lang w:eastAsia="ja-JP"/>
+        </w:rPr>
+      </w:pPr>
+      <w:r>
+        <w:rPr>
+          <w:b/>
+          <w:lang w:eastAsia="ja-JP"/>
+        </w:rPr>
+        <w:t xml:space="preserve">4. </w:t>
+      </w:r>
+      <w:r>
+        <w:rPr>
+          <w:lang w:eastAsia="ja-JP"/>
+        </w:rPr>
+        <w:t>通話が終わったら、架電結果を選択してください（下記「架電結果コード一覧」を参照）。</w:t>
+      </w:r>
+    </w:p>
+    <w:p>
+      <w:pPr>
+        <w:ind w:left="567"/>
+        <w:rPr>
+          <w:lang w:eastAsia="ja-JP"/>
+        </w:rPr>
+      </w:pPr>
+      <w:r>
+        <w:rPr>
+          <w:b/>
+          <w:lang w:eastAsia="ja-JP"/>
+        </w:rPr>
+        <w:t xml:space="preserve">5. </w:t>
+      </w:r>
+      <w:r>
+        <w:rPr>
+          <w:lang w:eastAsia="ja-JP"/>
+        </w:rPr>
+        <w:t>該当する場合は、チェックボックスにチェックを入れてください：</w:t>
+      </w:r>
+    </w:p>
+    <w:p>
+      <w:pPr>
+        <w:ind w:left="850" w:hanging="283"/>
+        <w:rPr>
+          <w:lang w:eastAsia="ja-JP"/>
+        </w:rPr>
+      </w:pPr>
+      <w:r>
+        <w:rPr>
+          <w:lang w:eastAsia="ja-JP"/>
+        </w:rPr>
+        <w:t>・「有効接続」：相手</w:t>
+      </w:r>
+      <w:r>
+        <w:rPr>
+          <w:rFonts w:hint="eastAsia"/>
+          <w:lang w:eastAsia="ja-JP"/>
+        </w:rPr>
+        <w:t>にサービス説明</w:t>
+      </w:r>
+      <w:r>
+        <w:rPr>
+          <w:lang w:eastAsia="ja-JP"/>
+        </w:rPr>
+        <w:t>ができた場合</w:t>
+      </w:r>
+    </w:p>
+    <w:p>
+      <w:pPr>
+        <w:ind w:left="850" w:hanging="283"/>
+        <w:rPr>
+          <w:lang w:eastAsia="ja-JP"/>
+        </w:rPr>
+      </w:pPr>
+      <w:r>
+        <w:rPr>
+          <w:lang w:eastAsia="ja-JP"/>
+        </w:rPr>
         <w:lastRenderedPageBreak/>
-        <w:t xml:space="preserve">2. </w:t>
-      </w:r>
-      <w:r>
-        <w:rPr>
-          <w:lang w:eastAsia="ja-JP"/>
-        </w:rPr>
-        <w:t>「架電開始」（緑色のボタン）をクリックしてください。</w:t>
-      </w:r>
-      <w:proofErr w:type="spellStart"/>
-      <w:r>
-        <w:rPr>
-          <w:rFonts w:hint="eastAsia"/>
-          <w:lang w:eastAsia="ja-JP"/>
-        </w:rPr>
-        <w:t>ZoomPhone</w:t>
-      </w:r>
-      <w:proofErr w:type="spellEnd"/>
-      <w:r>
-        <w:rPr>
-          <w:rFonts w:hint="eastAsia"/>
-          <w:lang w:eastAsia="ja-JP"/>
-        </w:rPr>
-        <w:t>への自動架電</w:t>
-      </w:r>
-      <w:r>
-        <w:rPr>
-          <w:lang w:eastAsia="ja-JP"/>
-        </w:rPr>
-        <w:t>が開始します。</w:t>
+        <w:t>・「担当接続」：担当者に繋がった場合</w:t>
       </w:r>
     </w:p>
     <w:p>
@@ -2760,13 +3226,13 @@
           <w:b/>
           <w:lang w:eastAsia="ja-JP"/>
         </w:rPr>
-        <w:t xml:space="preserve">3. </w:t>
-      </w:r>
-      <w:r>
-        <w:rPr>
-          <w:lang w:eastAsia="ja-JP"/>
-        </w:rPr>
-        <w:t>電話をかけてください。</w:t>
+        <w:t xml:space="preserve">6. </w:t>
+      </w:r>
+      <w:r>
+        <w:rPr>
+          <w:lang w:eastAsia="ja-JP"/>
+        </w:rPr>
+        <w:t>リコール（RECALL）を選択した場合は、リコールの日時を設定してください。</w:t>
       </w:r>
     </w:p>
     <w:p>
@@ -2781,13 +3247,13 @@
           <w:b/>
           <w:lang w:eastAsia="ja-JP"/>
         </w:rPr>
-        <w:t xml:space="preserve">4. </w:t>
-      </w:r>
-      <w:r>
-        <w:rPr>
-          <w:lang w:eastAsia="ja-JP"/>
-        </w:rPr>
-        <w:t>通話が終わったら、架電結果を選択してください（下記「架電結果コード一覧」を参照）。</w:t>
+        <w:t xml:space="preserve">7. </w:t>
+      </w:r>
+      <w:r>
+        <w:rPr>
+          <w:lang w:eastAsia="ja-JP"/>
+        </w:rPr>
+        <w:t>メモ欄に通話内容や特記事項を入力してください。</w:t>
       </w:r>
     </w:p>
     <w:p>
@@ -2802,122 +3268,26 @@
           <w:b/>
           <w:lang w:eastAsia="ja-JP"/>
         </w:rPr>
-        <w:t xml:space="preserve">5. </w:t>
-      </w:r>
-      <w:r>
-        <w:rPr>
-          <w:lang w:eastAsia="ja-JP"/>
-        </w:rPr>
-        <w:t>該当する場合は、チェックボックスにチェックを入れてください：</w:t>
-      </w:r>
-    </w:p>
-    <w:p>
-      <w:pPr>
-        <w:ind w:left="850" w:hanging="283"/>
-        <w:rPr>
-          <w:lang w:eastAsia="ja-JP"/>
-        </w:rPr>
-      </w:pPr>
-      <w:r>
-        <w:rPr>
-          <w:lang w:eastAsia="ja-JP"/>
-        </w:rPr>
-        <w:t>・「有効接続」：相手</w:t>
-      </w:r>
-      <w:r>
-        <w:rPr>
-          <w:rFonts w:hint="eastAsia"/>
-          <w:lang w:eastAsia="ja-JP"/>
-        </w:rPr>
-        <w:t>にサービス説明</w:t>
-      </w:r>
-      <w:r>
-        <w:rPr>
-          <w:lang w:eastAsia="ja-JP"/>
-        </w:rPr>
-        <w:t>ができた場合</w:t>
-      </w:r>
-    </w:p>
-    <w:p>
-      <w:pPr>
-        <w:ind w:left="850" w:hanging="283"/>
-        <w:rPr>
-          <w:lang w:eastAsia="ja-JP"/>
-        </w:rPr>
-      </w:pPr>
-      <w:r>
-        <w:rPr>
-          <w:lang w:eastAsia="ja-JP"/>
-        </w:rPr>
-        <w:t>・「担当接続」：担当者に繋がった場合</w:t>
+        <w:t xml:space="preserve">8. </w:t>
+      </w:r>
+      <w:r>
+        <w:rPr>
+          <w:lang w:eastAsia="ja-JP"/>
+        </w:rPr>
+        <w:t>「結果を保存」ボタンをクリックしてください。</w:t>
       </w:r>
     </w:p>
     <w:p>
       <w:pPr>
         <w:ind w:left="567"/>
         <w:rPr>
-          <w:lang w:eastAsia="ja-JP"/>
-        </w:rPr>
-      </w:pPr>
-      <w:r>
-        <w:rPr>
           <w:b/>
-          <w:lang w:eastAsia="ja-JP"/>
-        </w:rPr>
-        <w:t xml:space="preserve">6. </w:t>
-      </w:r>
-      <w:r>
-        <w:rPr>
-          <w:lang w:eastAsia="ja-JP"/>
-        </w:rPr>
-        <w:t>リコール（RECALL）を選択した場合は、リコールの日時を設定してください。</w:t>
-      </w:r>
-    </w:p>
-    <w:p>
-      <w:pPr>
-        <w:ind w:left="567"/>
-        <w:rPr>
-          <w:lang w:eastAsia="ja-JP"/>
-        </w:rPr>
-      </w:pPr>
-      <w:r>
-        <w:rPr>
-          <w:b/>
-          <w:lang w:eastAsia="ja-JP"/>
-        </w:rPr>
-        <w:t xml:space="preserve">7. </w:t>
-      </w:r>
-      <w:r>
-        <w:rPr>
-          <w:lang w:eastAsia="ja-JP"/>
-        </w:rPr>
-        <w:t>メモ欄に通話内容や特記事項を入力してください。</w:t>
-      </w:r>
-    </w:p>
-    <w:p>
-      <w:pPr>
-        <w:ind w:left="567"/>
-        <w:rPr>
-          <w:lang w:eastAsia="ja-JP"/>
-        </w:rPr>
-      </w:pPr>
-      <w:r>
-        <w:rPr>
-          <w:b/>
-          <w:lang w:eastAsia="ja-JP"/>
-        </w:rPr>
-        <w:t xml:space="preserve">8. </w:t>
-      </w:r>
-      <w:r>
-        <w:rPr>
-          <w:lang w:eastAsia="ja-JP"/>
-        </w:rPr>
-        <w:t>「結果を保存」ボタンをクリックしてください。</w:t>
-      </w:r>
-    </w:p>
-    <w:p>
-      <w:pPr>
-        <w:ind w:left="567"/>
+          <w:bCs/>
+          <w:color w:val="EE0000"/>
+          <w:lang w:eastAsia="ja-JP"/>
+        </w:rPr>
+      </w:pPr>
+      <w:r>
         <w:rPr>
           <w:rFonts w:hint="eastAsia"/>
           <w:b/>
@@ -2925,7 +3295,8 @@
           <w:color w:val="EE0000"/>
           <w:lang w:eastAsia="ja-JP"/>
         </w:rPr>
-      </w:pPr>
+        <w:t>※</w:t>
+      </w:r>
       <w:r>
         <w:rPr>
           <w:rFonts w:hint="eastAsia"/>
@@ -2934,7 +3305,7 @@
           <w:color w:val="EE0000"/>
           <w:lang w:eastAsia="ja-JP"/>
         </w:rPr>
-        <w:t>※</w:t>
+        <w:t xml:space="preserve"> </w:t>
       </w:r>
       <w:r>
         <w:rPr>
@@ -2944,64 +3315,91 @@
           <w:color w:val="EE0000"/>
           <w:lang w:eastAsia="ja-JP"/>
         </w:rPr>
-        <w:t xml:space="preserve"> </w:t>
-      </w:r>
+        <w:t>一時停止したいときは先に架電停止ボタンを押してから結果を保存してください。</w:t>
+      </w:r>
+    </w:p>
+    <w:p>
+      <w:pPr>
+        <w:ind w:left="567"/>
+        <w:rPr>
+          <w:lang w:eastAsia="ja-JP"/>
+        </w:rPr>
+      </w:pPr>
       <w:r>
         <w:rPr>
           <w:rFonts w:hint="eastAsia"/>
           <w:b/>
-          <w:bCs/>
-          <w:color w:val="EE0000"/>
-          <w:lang w:eastAsia="ja-JP"/>
-        </w:rPr>
-        <w:t>一時停止したいときは</w:t>
-      </w:r>
-      <w:r>
+          <w:lang w:eastAsia="ja-JP"/>
+        </w:rPr>
+        <w:t>9．結果が「不通」「NG」の場合は自動で次の架電先にコールします。</w:t>
+      </w:r>
+    </w:p>
+    <w:p>
+      <w:pPr>
+        <w:pStyle w:val="21"/>
+        <w:rPr>
+          <w:lang w:eastAsia="ja-JP"/>
+        </w:rPr>
+      </w:pPr>
+      <w:r>
+        <w:rPr>
+          <w:lang w:eastAsia="ja-JP"/>
+        </w:rPr>
+        <w:t xml:space="preserve">4.5 </w:t>
+      </w:r>
+      <w:r>
+        <w:rPr>
+          <w:lang w:eastAsia="ja-JP"/>
+        </w:rPr>
+        <w:t>架電結果コード一覧</w:t>
+      </w:r>
+    </w:p>
+    <w:p>
+      <w:pPr>
         <w:rPr>
           <w:rFonts w:hint="eastAsia"/>
-          <w:b/>
-          <w:bCs/>
-          <w:color w:val="EE0000"/>
-          <w:lang w:eastAsia="ja-JP"/>
-        </w:rPr>
-        <w:t>先に架電停止ボタンを押してから結果を保存してください。</w:t>
-      </w:r>
-    </w:p>
-    <w:p>
-      <w:pPr>
-        <w:ind w:left="567"/>
-        <w:rPr>
-          <w:rFonts w:hint="eastAsia"/>
-          <w:lang w:eastAsia="ja-JP"/>
-        </w:rPr>
-      </w:pPr>
-      <w:r>
-        <w:rPr>
-          <w:rFonts w:hint="eastAsia"/>
-          <w:b/>
-          <w:lang w:eastAsia="ja-JP"/>
-        </w:rPr>
-        <w:t>9．結果が「不通」「NG」の場合は自動で次の架電先にコールします。</w:t>
-      </w:r>
-    </w:p>
-    <w:p>
-      <w:pPr>
-        <w:pStyle w:val="21"/>
-        <w:rPr>
-          <w:lang w:eastAsia="ja-JP"/>
-        </w:rPr>
-      </w:pPr>
-      <w:r>
-        <w:rPr>
-          <w:lang w:eastAsia="ja-JP"/>
-        </w:rPr>
-        <w:t xml:space="preserve">4.5 </w:t>
-      </w:r>
-      <w:r>
-        <w:rPr>
-          <w:lang w:eastAsia="ja-JP"/>
-        </w:rPr>
-        <w:t>架電結果コード一覧</w:t>
+          <w:lang w:eastAsia="ja-JP"/>
+        </w:rPr>
+      </w:pPr>
+      <w:r>
+        <w:rPr>
+          <w:lang w:eastAsia="ja-JP"/>
+        </w:rPr>
+        <w:drawing>
+          <wp:inline distT="0" distB="0" distL="0" distR="0" wp14:anchorId="0BD857E3" wp14:editId="05B050B2">
+            <wp:extent cx="2372056" cy="4639322"/>
+            <wp:effectExtent l="0" t="0" r="9525" b="8890"/>
+            <wp:docPr id="1695148266" name="図 1"/>
+            <wp:cNvGraphicFramePr>
+              <a:graphicFrameLocks xmlns:a="http://schemas.openxmlformats.org/drawingml/2006/main" noChangeAspect="1"/>
+            </wp:cNvGraphicFramePr>
+            <a:graphic xmlns:a="http://schemas.openxmlformats.org/drawingml/2006/main">
+              <a:graphicData uri="http://schemas.openxmlformats.org/drawingml/2006/picture">
+                <pic:pic xmlns:pic="http://schemas.openxmlformats.org/drawingml/2006/picture">
+                  <pic:nvPicPr>
+                    <pic:cNvPr id="1695148266" name=""/>
+                    <pic:cNvPicPr/>
+                  </pic:nvPicPr>
+                  <pic:blipFill>
+                    <a:blip r:embed="rId17"/>
+                    <a:stretch>
+                      <a:fillRect/>
+                    </a:stretch>
+                  </pic:blipFill>
+                  <pic:spPr>
+                    <a:xfrm>
+                      <a:off x="0" y="0"/>
+                      <a:ext cx="2372056" cy="4639322"/>
+                    </a:xfrm>
+                    <a:prstGeom prst="rect">
+                      <a:avLst/>
+                    </a:prstGeom>
+                  </pic:spPr>
+                </pic:pic>
+              </a:graphicData>
+            </a:graphic>
+          </wp:inline>
+        </w:drawing>
       </w:r>
     </w:p>
     <w:p>
@@ -3042,7 +3440,6 @@
             <w:pPr>
               <w:jc w:val="center"/>
             </w:pPr>
-            <w:proofErr w:type="spellStart"/>
             <w:r>
               <w:rPr>
                 <w:b/>
@@ -3051,7 +3448,6 @@
               </w:rPr>
               <w:t>結果コード</w:t>
             </w:r>
-            <w:proofErr w:type="spellEnd"/>
           </w:p>
         </w:tc>
         <w:tc>
@@ -3157,6 +3553,7 @@
               <w:rPr>
                 <w:sz w:val="19"/>
               </w:rPr>
+              <w:lastRenderedPageBreak/>
               <w:t>NG</w:t>
             </w:r>
           </w:p>
@@ -3383,6 +3780,7 @@
           <w:p>
             <w:pPr>
               <w:rPr>
+                <w:sz w:val="19"/>
                 <w:lang w:eastAsia="ja-JP"/>
               </w:rPr>
             </w:pPr>
@@ -3392,6 +3790,22 @@
                 <w:lang w:eastAsia="ja-JP"/>
               </w:rPr>
               <w:t>この企業を飛ばして次に進む</w:t>
+            </w:r>
+          </w:p>
+          <w:p>
+            <w:pPr>
+              <w:rPr>
+                <w:rFonts w:hint="eastAsia"/>
+                <w:lang w:eastAsia="ja-JP"/>
+              </w:rPr>
+            </w:pPr>
+            <w:r>
+              <w:rPr>
+                <w:rFonts w:hint="eastAsia"/>
+                <w:sz w:val="19"/>
+                <w:lang w:eastAsia="ja-JP"/>
+              </w:rPr>
+              <w:t>※スキップについては左のリスト内にあり、カーソルを合わせると表示されます。</w:t>
             </w:r>
           </w:p>
         </w:tc>
@@ -3450,7 +3864,6 @@
           <w:b/>
           <w:lang w:eastAsia="ja-JP"/>
         </w:rPr>
-        <w:lastRenderedPageBreak/>
         <w:t>1</w:t>
       </w:r>
       <w:r>
@@ -3603,1153 +4016,6 @@
         </w:rPr>
         <w:t>案件情報入力モーダルでは、以下の項目を入力してください：</w:t>
       </w:r>
-    </w:p>
-    <w:tbl>
-      <w:tblPr>
-        <w:tblStyle w:val="afe"/>
-        <w:tblW w:w="0" w:type="auto"/>
-        <w:jc w:val="center"/>
-        <w:tblLook w:val="04A0" w:firstRow="1" w:lastRow="0" w:firstColumn="1" w:lastColumn="0" w:noHBand="0" w:noVBand="1"/>
-      </w:tblPr>
-      <w:tblGrid>
-        <w:gridCol w:w="2268"/>
-        <w:gridCol w:w="6803"/>
-      </w:tblGrid>
-      <w:tr>
-        <w:trPr>
-          <w:jc w:val="center"/>
-        </w:trPr>
-        <w:tc>
-          <w:tcPr>
-            <w:tcW w:w="2268" w:type="dxa"/>
-            <w:shd w:val="clear" w:color="auto" w:fill="1A478A"/>
-          </w:tcPr>
-          <w:p>
-            <w:pPr>
-              <w:jc w:val="center"/>
-            </w:pPr>
-            <w:proofErr w:type="spellStart"/>
-            <w:r>
-              <w:rPr>
-                <w:b/>
-                <w:color w:val="FFFFFF"/>
-                <w:sz w:val="19"/>
-              </w:rPr>
-              <w:t>項目</w:t>
-            </w:r>
-            <w:proofErr w:type="spellEnd"/>
-          </w:p>
-        </w:tc>
-        <w:tc>
-          <w:tcPr>
-            <w:tcW w:w="6803" w:type="dxa"/>
-            <w:shd w:val="clear" w:color="auto" w:fill="1A478A"/>
-          </w:tcPr>
-          <w:p>
-            <w:pPr>
-              <w:jc w:val="center"/>
-            </w:pPr>
-            <w:r>
-              <w:rPr>
-                <w:b/>
-                <w:color w:val="FFFFFF"/>
-                <w:sz w:val="19"/>
-              </w:rPr>
-              <w:t>入力内容</w:t>
-            </w:r>
-          </w:p>
-        </w:tc>
-      </w:tr>
-      <w:tr>
-        <w:trPr>
-          <w:jc w:val="center"/>
-        </w:trPr>
-        <w:tc>
-          <w:tcPr>
-            <w:tcW w:w="2268" w:type="dxa"/>
-          </w:tcPr>
-          <w:p>
-            <w:r>
-              <w:rPr>
-                <w:sz w:val="19"/>
-              </w:rPr>
-              <w:t>ステータス</w:t>
-            </w:r>
-          </w:p>
-        </w:tc>
-        <w:tc>
-          <w:tcPr>
-            <w:tcW w:w="6803" w:type="dxa"/>
-          </w:tcPr>
-          <w:p>
-            <w:pPr>
-              <w:rPr>
-                <w:lang w:eastAsia="ja-JP"/>
-              </w:rPr>
-            </w:pPr>
-            <w:r>
-              <w:rPr>
-                <w:sz w:val="19"/>
-                <w:lang w:eastAsia="ja-JP"/>
-              </w:rPr>
-              <w:t>案件の現在の状態を選択</w:t>
-            </w:r>
-          </w:p>
-        </w:tc>
-      </w:tr>
-      <w:tr>
-        <w:trPr>
-          <w:jc w:val="center"/>
-        </w:trPr>
-        <w:tc>
-          <w:tcPr>
-            <w:tcW w:w="2268" w:type="dxa"/>
-            <w:shd w:val="clear" w:color="auto" w:fill="F0F4FA"/>
-          </w:tcPr>
-          <w:p>
-            <w:proofErr w:type="spellStart"/>
-            <w:r>
-              <w:rPr>
-                <w:sz w:val="19"/>
-              </w:rPr>
-              <w:t>求人番号</w:t>
-            </w:r>
-            <w:proofErr w:type="spellEnd"/>
-          </w:p>
-        </w:tc>
-        <w:tc>
-          <w:tcPr>
-            <w:tcW w:w="6803" w:type="dxa"/>
-            <w:shd w:val="clear" w:color="auto" w:fill="F0F4FA"/>
-          </w:tcPr>
-          <w:p>
-            <w:pPr>
-              <w:rPr>
-                <w:lang w:eastAsia="ja-JP"/>
-              </w:rPr>
-            </w:pPr>
-            <w:r>
-              <w:rPr>
-                <w:sz w:val="19"/>
-                <w:lang w:eastAsia="ja-JP"/>
-              </w:rPr>
-              <w:t>ハローワークの求人番号</w:t>
-            </w:r>
-          </w:p>
-        </w:tc>
-      </w:tr>
-      <w:tr>
-        <w:trPr>
-          <w:jc w:val="center"/>
-        </w:trPr>
-        <w:tc>
-          <w:tcPr>
-            <w:tcW w:w="2268" w:type="dxa"/>
-          </w:tcPr>
-          <w:p>
-            <w:proofErr w:type="spellStart"/>
-            <w:r>
-              <w:rPr>
-                <w:sz w:val="19"/>
-              </w:rPr>
-              <w:t>面談日</w:t>
-            </w:r>
-            <w:proofErr w:type="spellEnd"/>
-          </w:p>
-        </w:tc>
-        <w:tc>
-          <w:tcPr>
-            <w:tcW w:w="6803" w:type="dxa"/>
-          </w:tcPr>
-          <w:p>
-            <w:r>
-              <w:rPr>
-                <w:sz w:val="19"/>
-              </w:rPr>
-              <w:t>面談の予定日</w:t>
-            </w:r>
-          </w:p>
-        </w:tc>
-      </w:tr>
-      <w:tr>
-        <w:trPr>
-          <w:jc w:val="center"/>
-        </w:trPr>
-        <w:tc>
-          <w:tcPr>
-            <w:tcW w:w="2268" w:type="dxa"/>
-            <w:shd w:val="clear" w:color="auto" w:fill="F0F4FA"/>
-          </w:tcPr>
-          <w:p>
-            <w:r>
-              <w:rPr>
-                <w:sz w:val="19"/>
-              </w:rPr>
-              <w:t>面談種別</w:t>
-            </w:r>
-          </w:p>
-        </w:tc>
-        <w:tc>
-          <w:tcPr>
-            <w:tcW w:w="6803" w:type="dxa"/>
-            <w:shd w:val="clear" w:color="auto" w:fill="F0F4FA"/>
-          </w:tcPr>
-          <w:p>
-            <w:pPr>
-              <w:rPr>
-                <w:lang w:eastAsia="ja-JP"/>
-              </w:rPr>
-            </w:pPr>
-            <w:r>
-              <w:rPr>
-                <w:sz w:val="19"/>
-                <w:lang w:eastAsia="ja-JP"/>
-              </w:rPr>
-              <w:t>面談の方法（対面、オンラインなど）</w:t>
-            </w:r>
-          </w:p>
-        </w:tc>
-      </w:tr>
-      <w:tr>
-        <w:trPr>
-          <w:jc w:val="center"/>
-        </w:trPr>
-        <w:tc>
-          <w:tcPr>
-            <w:tcW w:w="2268" w:type="dxa"/>
-          </w:tcPr>
-          <w:p>
-            <w:proofErr w:type="spellStart"/>
-            <w:r>
-              <w:rPr>
-                <w:sz w:val="19"/>
-              </w:rPr>
-              <w:t>企業担当者</w:t>
-            </w:r>
-            <w:proofErr w:type="spellEnd"/>
-          </w:p>
-        </w:tc>
-        <w:tc>
-          <w:tcPr>
-            <w:tcW w:w="6803" w:type="dxa"/>
-          </w:tcPr>
-          <w:p>
-            <w:r>
-              <w:rPr>
-                <w:sz w:val="19"/>
-              </w:rPr>
-              <w:t>企業側の担当者名</w:t>
-            </w:r>
-          </w:p>
-        </w:tc>
-      </w:tr>
-      <w:tr>
-        <w:trPr>
-          <w:jc w:val="center"/>
-        </w:trPr>
-        <w:tc>
-          <w:tcPr>
-            <w:tcW w:w="2268" w:type="dxa"/>
-            <w:shd w:val="clear" w:color="auto" w:fill="F0F4FA"/>
-          </w:tcPr>
-          <w:p>
-            <w:r>
-              <w:rPr>
-                <w:sz w:val="19"/>
-              </w:rPr>
-              <w:t>連絡先</w:t>
-            </w:r>
-          </w:p>
-        </w:tc>
-        <w:tc>
-          <w:tcPr>
-            <w:tcW w:w="6803" w:type="dxa"/>
-            <w:shd w:val="clear" w:color="auto" w:fill="F0F4FA"/>
-          </w:tcPr>
-          <w:p>
-            <w:r>
-              <w:rPr>
-                <w:sz w:val="19"/>
-              </w:rPr>
-              <w:t>企業の連絡先情報</w:t>
-            </w:r>
-          </w:p>
-        </w:tc>
-      </w:tr>
-      <w:tr>
-        <w:trPr>
-          <w:jc w:val="center"/>
-        </w:trPr>
-        <w:tc>
-          <w:tcPr>
-            <w:tcW w:w="2268" w:type="dxa"/>
-          </w:tcPr>
-          <w:p>
-            <w:pPr>
-              <w:rPr>
-                <w:lang w:eastAsia="ja-JP"/>
-              </w:rPr>
-            </w:pPr>
-            <w:r>
-              <w:rPr>
-                <w:sz w:val="19"/>
-                <w:lang w:eastAsia="ja-JP"/>
-              </w:rPr>
-              <w:t>各種チェックボックス</w:t>
-            </w:r>
-          </w:p>
-        </w:tc>
-        <w:tc>
-          <w:tcPr>
-            <w:tcW w:w="6803" w:type="dxa"/>
-          </w:tcPr>
-          <w:p>
-            <w:pPr>
-              <w:rPr>
-                <w:lang w:eastAsia="ja-JP"/>
-              </w:rPr>
-            </w:pPr>
-            <w:r>
-              <w:rPr>
-                <w:sz w:val="19"/>
-                <w:lang w:eastAsia="ja-JP"/>
-              </w:rPr>
-              <w:t>該当する項目にチェック</w:t>
-            </w:r>
-          </w:p>
-        </w:tc>
-      </w:tr>
-    </w:tbl>
-    <w:p>
-      <w:pPr>
-        <w:pStyle w:val="21"/>
-        <w:rPr>
-          <w:lang w:eastAsia="ja-JP"/>
-        </w:rPr>
-      </w:pPr>
-      <w:r>
-        <w:rPr>
-          <w:lang w:eastAsia="ja-JP"/>
-        </w:rPr>
-        <w:t xml:space="preserve">4.8 </w:t>
-      </w:r>
-      <w:r>
-        <w:rPr>
-          <w:lang w:eastAsia="ja-JP"/>
-        </w:rPr>
-        <w:t>スクリプト・切り返しトーク</w:t>
-      </w:r>
-    </w:p>
-    <w:p>
-      <w:pPr>
-        <w:rPr>
-          <w:lang w:eastAsia="ja-JP"/>
-        </w:rPr>
-      </w:pPr>
-      <w:r>
-        <w:rPr>
-          <w:lang w:eastAsia="ja-JP"/>
-        </w:rPr>
-        <w:t>架電中に使えるトークスクリプトやQ&amp;Aを検索できます：</w:t>
-      </w:r>
-    </w:p>
-    <w:p>
-      <w:pPr>
-        <w:ind w:left="567"/>
-        <w:rPr>
-          <w:lang w:eastAsia="ja-JP"/>
-        </w:rPr>
-      </w:pPr>
-      <w:r>
-        <w:rPr>
-          <w:b/>
-          <w:lang w:eastAsia="ja-JP"/>
-        </w:rPr>
-        <w:t xml:space="preserve">1. </w:t>
-      </w:r>
-      <w:r>
-        <w:rPr>
-          <w:lang w:eastAsia="ja-JP"/>
-        </w:rPr>
-        <w:t>スクリプトパネルを開いてください。</w:t>
-      </w:r>
-    </w:p>
-    <w:p>
-      <w:pPr>
-        <w:ind w:left="567"/>
-        <w:rPr>
-          <w:lang w:eastAsia="ja-JP"/>
-        </w:rPr>
-      </w:pPr>
-      <w:r>
-        <w:rPr>
-          <w:b/>
-          <w:lang w:eastAsia="ja-JP"/>
-        </w:rPr>
-        <w:t xml:space="preserve">2. </w:t>
-      </w:r>
-      <w:r>
-        <w:rPr>
-          <w:lang w:eastAsia="ja-JP"/>
-        </w:rPr>
-        <w:t>キーワードまたは業種で検索してください。</w:t>
-      </w:r>
-    </w:p>
-    <w:p>
-      <w:pPr>
-        <w:ind w:left="567"/>
-        <w:rPr>
-          <w:lang w:eastAsia="ja-JP"/>
-        </w:rPr>
-      </w:pPr>
-      <w:r>
-        <w:rPr>
-          <w:b/>
-          <w:lang w:eastAsia="ja-JP"/>
-        </w:rPr>
-        <w:t xml:space="preserve">3. </w:t>
-      </w:r>
-      <w:r>
-        <w:rPr>
-          <w:lang w:eastAsia="ja-JP"/>
-        </w:rPr>
-        <w:t>該当するトークスクリプトやQ&amp;Aが表示されます。</w:t>
-      </w:r>
-    </w:p>
-    <w:p>
-      <w:pPr>
-        <w:ind w:left="567"/>
-        <w:rPr>
-          <w:lang w:eastAsia="ja-JP"/>
-        </w:rPr>
-      </w:pPr>
-      <w:r>
-        <w:rPr>
-          <w:lang w:eastAsia="ja-JP"/>
-        </w:rPr>
-        <w:t xml:space="preserve">💡 </w:t>
-      </w:r>
-      <w:r>
-        <w:rPr>
-          <w:color w:val="336699"/>
-          <w:sz w:val="19"/>
-          <w:lang w:eastAsia="ja-JP"/>
-        </w:rPr>
-        <w:t>よくある質問への回答や、断られたときの切り返しトークを確認できます。</w:t>
-      </w:r>
-    </w:p>
-    <w:p>
-      <w:pPr>
-        <w:rPr>
-          <w:lang w:eastAsia="ja-JP"/>
-        </w:rPr>
-      </w:pPr>
-      <w:r>
-        <w:rPr>
-          <w:lang w:eastAsia="ja-JP"/>
-        </w:rPr>
-        <w:br w:type="page"/>
-      </w:r>
-    </w:p>
-    <w:p>
-      <w:pPr>
-        <w:pStyle w:val="1"/>
-        <w:rPr>
-          <w:lang w:eastAsia="ja-JP"/>
-        </w:rPr>
-      </w:pPr>
-      <w:r>
-        <w:rPr>
-          <w:lang w:eastAsia="ja-JP"/>
-        </w:rPr>
-        <w:lastRenderedPageBreak/>
-        <w:t xml:space="preserve">5. </w:t>
-      </w:r>
-      <w:r>
-        <w:rPr>
-          <w:lang w:eastAsia="ja-JP"/>
-        </w:rPr>
-        <w:t>リコール管理</w:t>
-      </w:r>
-    </w:p>
-    <w:p>
-      <w:pPr>
-        <w:rPr>
-          <w:lang w:eastAsia="ja-JP"/>
-        </w:rPr>
-      </w:pPr>
-      <w:r>
-        <w:rPr>
-          <w:lang w:eastAsia="ja-JP"/>
-        </w:rPr>
-        <w:t>リコール管理画面では、再架電の予定を一覧で確認・管理できます。</w:t>
-      </w:r>
-    </w:p>
-    <w:p>
-      <w:pPr>
-        <w:pStyle w:val="21"/>
-        <w:rPr>
-          <w:lang w:eastAsia="ja-JP"/>
-        </w:rPr>
-      </w:pPr>
-      <w:r>
-        <w:rPr>
-          <w:lang w:eastAsia="ja-JP"/>
-        </w:rPr>
-        <w:t xml:space="preserve">5.1 </w:t>
-      </w:r>
-      <w:r>
-        <w:rPr>
-          <w:lang w:eastAsia="ja-JP"/>
-        </w:rPr>
-        <w:t>リコール一覧の確認</w:t>
-      </w:r>
-    </w:p>
-    <w:p>
-      <w:pPr>
-        <w:rPr>
-          <w:lang w:eastAsia="ja-JP"/>
-        </w:rPr>
-      </w:pPr>
-      <w:r>
-        <w:rPr>
-          <w:lang w:eastAsia="ja-JP"/>
-        </w:rPr>
-        <w:t>画面上部のタブで、リコールを期間別に確認できます：</w:t>
-      </w:r>
-    </w:p>
-    <w:tbl>
-      <w:tblPr>
-        <w:tblStyle w:val="afe"/>
-        <w:tblW w:w="0" w:type="auto"/>
-        <w:jc w:val="center"/>
-        <w:tblLook w:val="04A0" w:firstRow="1" w:lastRow="0" w:firstColumn="1" w:lastColumn="0" w:noHBand="0" w:noVBand="1"/>
-      </w:tblPr>
-      <w:tblGrid>
-        <w:gridCol w:w="1701"/>
-        <w:gridCol w:w="7370"/>
-      </w:tblGrid>
-      <w:tr>
-        <w:trPr>
-          <w:jc w:val="center"/>
-        </w:trPr>
-        <w:tc>
-          <w:tcPr>
-            <w:tcW w:w="1701" w:type="dxa"/>
-            <w:shd w:val="clear" w:color="auto" w:fill="1A478A"/>
-          </w:tcPr>
-          <w:p>
-            <w:pPr>
-              <w:jc w:val="center"/>
-            </w:pPr>
-            <w:proofErr w:type="spellStart"/>
-            <w:r>
-              <w:rPr>
-                <w:b/>
-                <w:color w:val="FFFFFF"/>
-                <w:sz w:val="19"/>
-              </w:rPr>
-              <w:t>タブ名</w:t>
-            </w:r>
-            <w:proofErr w:type="spellEnd"/>
-          </w:p>
-        </w:tc>
-        <w:tc>
-          <w:tcPr>
-            <w:tcW w:w="7370" w:type="dxa"/>
-            <w:shd w:val="clear" w:color="auto" w:fill="1A478A"/>
-          </w:tcPr>
-          <w:p>
-            <w:pPr>
-              <w:jc w:val="center"/>
-            </w:pPr>
-            <w:r>
-              <w:rPr>
-                <w:b/>
-                <w:color w:val="FFFFFF"/>
-                <w:sz w:val="19"/>
-              </w:rPr>
-              <w:t>内容</w:t>
-            </w:r>
-          </w:p>
-        </w:tc>
-      </w:tr>
-      <w:tr>
-        <w:trPr>
-          <w:jc w:val="center"/>
-        </w:trPr>
-        <w:tc>
-          <w:tcPr>
-            <w:tcW w:w="1701" w:type="dxa"/>
-          </w:tcPr>
-          <w:p>
-            <w:r>
-              <w:rPr>
-                <w:sz w:val="19"/>
-              </w:rPr>
-              <w:t>今日</w:t>
-            </w:r>
-          </w:p>
-        </w:tc>
-        <w:tc>
-          <w:tcPr>
-            <w:tcW w:w="7370" w:type="dxa"/>
-          </w:tcPr>
-          <w:p>
-            <w:r>
-              <w:rPr>
-                <w:sz w:val="19"/>
-              </w:rPr>
-              <w:t>本日予定のリコール</w:t>
-            </w:r>
-          </w:p>
-        </w:tc>
-      </w:tr>
-      <w:tr>
-        <w:trPr>
-          <w:jc w:val="center"/>
-        </w:trPr>
-        <w:tc>
-          <w:tcPr>
-            <w:tcW w:w="1701" w:type="dxa"/>
-            <w:shd w:val="clear" w:color="auto" w:fill="F0F4FA"/>
-          </w:tcPr>
-          <w:p>
-            <w:r>
-              <w:rPr>
-                <w:sz w:val="19"/>
-              </w:rPr>
-              <w:t>明日</w:t>
-            </w:r>
-          </w:p>
-        </w:tc>
-        <w:tc>
-          <w:tcPr>
-            <w:tcW w:w="7370" w:type="dxa"/>
-            <w:shd w:val="clear" w:color="auto" w:fill="F0F4FA"/>
-          </w:tcPr>
-          <w:p>
-            <w:r>
-              <w:rPr>
-                <w:sz w:val="19"/>
-              </w:rPr>
-              <w:t>明日予定のリコール</w:t>
-            </w:r>
-          </w:p>
-        </w:tc>
-      </w:tr>
-      <w:tr>
-        <w:trPr>
-          <w:jc w:val="center"/>
-        </w:trPr>
-        <w:tc>
-          <w:tcPr>
-            <w:tcW w:w="1701" w:type="dxa"/>
-          </w:tcPr>
-          <w:p>
-            <w:r>
-              <w:rPr>
-                <w:sz w:val="19"/>
-              </w:rPr>
-              <w:t>期限超過</w:t>
-            </w:r>
-          </w:p>
-        </w:tc>
-        <w:tc>
-          <w:tcPr>
-            <w:tcW w:w="7370" w:type="dxa"/>
-          </w:tcPr>
-          <w:p>
-            <w:pPr>
-              <w:rPr>
-                <w:lang w:eastAsia="ja-JP"/>
-              </w:rPr>
-            </w:pPr>
-            <w:r>
-              <w:rPr>
-                <w:sz w:val="19"/>
-                <w:lang w:eastAsia="ja-JP"/>
-              </w:rPr>
-              <w:t>予定日を過ぎたリコール（早めに対応してください）</w:t>
-            </w:r>
-          </w:p>
-        </w:tc>
-      </w:tr>
-      <w:tr>
-        <w:trPr>
-          <w:jc w:val="center"/>
-        </w:trPr>
-        <w:tc>
-          <w:tcPr>
-            <w:tcW w:w="1701" w:type="dxa"/>
-            <w:shd w:val="clear" w:color="auto" w:fill="F0F4FA"/>
-          </w:tcPr>
-          <w:p>
-            <w:proofErr w:type="spellStart"/>
-            <w:r>
-              <w:rPr>
-                <w:sz w:val="19"/>
-              </w:rPr>
-              <w:t>その他</w:t>
-            </w:r>
-            <w:proofErr w:type="spellEnd"/>
-          </w:p>
-        </w:tc>
-        <w:tc>
-          <w:tcPr>
-            <w:tcW w:w="7370" w:type="dxa"/>
-            <w:shd w:val="clear" w:color="auto" w:fill="F0F4FA"/>
-          </w:tcPr>
-          <w:p>
-            <w:pPr>
-              <w:rPr>
-                <w:lang w:eastAsia="ja-JP"/>
-              </w:rPr>
-            </w:pPr>
-            <w:r>
-              <w:rPr>
-                <w:sz w:val="19"/>
-                <w:lang w:eastAsia="ja-JP"/>
-              </w:rPr>
-              <w:t>明後日以降のリコール</w:t>
-            </w:r>
-          </w:p>
-        </w:tc>
-      </w:tr>
-    </w:tbl>
-    <w:p>
-      <w:pPr>
-        <w:rPr>
-          <w:lang w:eastAsia="ja-JP"/>
-        </w:rPr>
-      </w:pPr>
-      <w:r>
-        <w:rPr>
-          <w:lang w:eastAsia="ja-JP"/>
-        </w:rPr>
-        <w:t>各リコールには以下の情報が表示されます：</w:t>
-      </w:r>
-    </w:p>
-    <w:p>
-      <w:pPr>
-        <w:ind w:left="567" w:hanging="283"/>
-        <w:rPr>
-          <w:lang w:eastAsia="ja-JP"/>
-        </w:rPr>
-      </w:pPr>
-      <w:r>
-        <w:rPr>
-          <w:lang w:eastAsia="ja-JP"/>
-        </w:rPr>
-        <w:t>・企業名</w:t>
-      </w:r>
-    </w:p>
-    <w:p>
-      <w:pPr>
-        <w:ind w:left="567" w:hanging="283"/>
-        <w:rPr>
-          <w:lang w:eastAsia="ja-JP"/>
-        </w:rPr>
-      </w:pPr>
-      <w:r>
-        <w:rPr>
-          <w:lang w:eastAsia="ja-JP"/>
-        </w:rPr>
-        <w:t>・電話番号</w:t>
-      </w:r>
-    </w:p>
-    <w:p>
-      <w:pPr>
-        <w:ind w:left="567" w:hanging="283"/>
-        <w:rPr>
-          <w:lang w:eastAsia="ja-JP"/>
-        </w:rPr>
-      </w:pPr>
-      <w:r>
-        <w:rPr>
-          <w:lang w:eastAsia="ja-JP"/>
-        </w:rPr>
-        <w:t>・業種</w:t>
-      </w:r>
-    </w:p>
-    <w:p>
-      <w:pPr>
-        <w:ind w:left="567" w:hanging="283"/>
-        <w:rPr>
-          <w:lang w:eastAsia="ja-JP"/>
-        </w:rPr>
-      </w:pPr>
-      <w:r>
-        <w:rPr>
-          <w:lang w:eastAsia="ja-JP"/>
-        </w:rPr>
-        <w:t>・リコール予定日時</w:t>
-      </w:r>
-    </w:p>
-    <w:p>
-      <w:pPr>
-        <w:ind w:left="567" w:hanging="283"/>
-        <w:rPr>
-          <w:lang w:eastAsia="ja-JP"/>
-        </w:rPr>
-      </w:pPr>
-      <w:r>
-        <w:rPr>
-          <w:lang w:eastAsia="ja-JP"/>
-        </w:rPr>
-        <w:t>・前回のメモ</w:t>
-      </w:r>
-    </w:p>
-    <w:p>
-      <w:pPr>
-        <w:pStyle w:val="21"/>
-        <w:rPr>
-          <w:lang w:eastAsia="ja-JP"/>
-        </w:rPr>
-      </w:pPr>
-      <w:r>
-        <w:rPr>
-          <w:lang w:eastAsia="ja-JP"/>
-        </w:rPr>
-        <w:t xml:space="preserve">5.2 </w:t>
-      </w:r>
-      <w:r>
-        <w:rPr>
-          <w:lang w:eastAsia="ja-JP"/>
-        </w:rPr>
-        <w:t>リコールの操作</w:t>
-      </w:r>
-    </w:p>
-    <w:p>
-      <w:pPr>
-        <w:rPr>
-          <w:lang w:eastAsia="ja-JP"/>
-        </w:rPr>
-      </w:pPr>
-      <w:r>
-        <w:rPr>
-          <w:lang w:eastAsia="ja-JP"/>
-        </w:rPr>
-        <w:t>■ 架電画面に移動する</w:t>
-      </w:r>
-    </w:p>
-    <w:p>
-      <w:pPr>
-        <w:ind w:left="567"/>
-        <w:rPr>
-          <w:lang w:eastAsia="ja-JP"/>
-        </w:rPr>
-      </w:pPr>
-      <w:r>
-        <w:rPr>
-          <w:b/>
-          <w:lang w:eastAsia="ja-JP"/>
-        </w:rPr>
-        <w:t xml:space="preserve">1. </w:t>
-      </w:r>
-      <w:r>
-        <w:rPr>
-          <w:lang w:eastAsia="ja-JP"/>
-        </w:rPr>
-        <w:t>リコール一覧から、架電したい企業をクリックしてください。</w:t>
-      </w:r>
-    </w:p>
-    <w:p>
-      <w:pPr>
-        <w:ind w:left="567"/>
-        <w:rPr>
-          <w:lang w:eastAsia="ja-JP"/>
-        </w:rPr>
-      </w:pPr>
-      <w:r>
-        <w:rPr>
-          <w:b/>
-          <w:lang w:eastAsia="ja-JP"/>
-        </w:rPr>
-        <w:t xml:space="preserve">2. </w:t>
-      </w:r>
-      <w:r>
-        <w:rPr>
-          <w:lang w:eastAsia="ja-JP"/>
-        </w:rPr>
-        <w:t>架電画面に移動し、その企業が選択された状態になります。</w:t>
-      </w:r>
-    </w:p>
-    <w:p>
-      <w:pPr>
-        <w:rPr>
-          <w:lang w:eastAsia="ja-JP"/>
-        </w:rPr>
-      </w:pPr>
-      <w:r>
-        <w:rPr>
-          <w:lang w:eastAsia="ja-JP"/>
-        </w:rPr>
-        <w:t>■ リコールを完了にする</w:t>
-      </w:r>
-    </w:p>
-    <w:p>
-      <w:pPr>
-        <w:ind w:left="567"/>
-        <w:rPr>
-          <w:lang w:eastAsia="ja-JP"/>
-        </w:rPr>
-      </w:pPr>
-      <w:r>
-        <w:rPr>
-          <w:b/>
-          <w:lang w:eastAsia="ja-JP"/>
-        </w:rPr>
-        <w:t xml:space="preserve">1. </w:t>
-      </w:r>
-      <w:r>
-        <w:rPr>
-          <w:lang w:eastAsia="ja-JP"/>
-        </w:rPr>
-        <w:t>対象のリコールの「完了」ボタンをクリックしてください。</w:t>
-      </w:r>
-    </w:p>
-    <w:p>
-      <w:pPr>
-        <w:ind w:left="567"/>
-        <w:rPr>
-          <w:lang w:eastAsia="ja-JP"/>
-        </w:rPr>
-      </w:pPr>
-      <w:r>
-        <w:rPr>
-          <w:b/>
-          <w:lang w:eastAsia="ja-JP"/>
-        </w:rPr>
-        <w:t xml:space="preserve">2. </w:t>
-      </w:r>
-      <w:r>
-        <w:rPr>
-          <w:lang w:eastAsia="ja-JP"/>
-        </w:rPr>
-        <w:t>リコールが完了状態になり、一覧から消えます。</w:t>
-      </w:r>
-    </w:p>
-    <w:p>
-      <w:pPr>
-        <w:rPr>
-          <w:lang w:eastAsia="ja-JP"/>
-        </w:rPr>
-      </w:pPr>
-      <w:r>
-        <w:rPr>
-          <w:lang w:eastAsia="ja-JP"/>
-        </w:rPr>
-        <w:t>■ リコールをキャンセルする</w:t>
-      </w:r>
-    </w:p>
-    <w:p>
-      <w:pPr>
-        <w:ind w:left="567"/>
-        <w:rPr>
-          <w:lang w:eastAsia="ja-JP"/>
-        </w:rPr>
-      </w:pPr>
-      <w:r>
-        <w:rPr>
-          <w:b/>
-          <w:lang w:eastAsia="ja-JP"/>
-        </w:rPr>
-        <w:lastRenderedPageBreak/>
-        <w:t xml:space="preserve">1. </w:t>
-      </w:r>
-      <w:r>
-        <w:rPr>
-          <w:lang w:eastAsia="ja-JP"/>
-        </w:rPr>
-        <w:t>対象のリコールの「キャンセル」ボタンをクリックしてください。</w:t>
-      </w:r>
-    </w:p>
-    <w:p>
-      <w:pPr>
-        <w:ind w:left="567"/>
-        <w:rPr>
-          <w:lang w:eastAsia="ja-JP"/>
-        </w:rPr>
-      </w:pPr>
-      <w:r>
-        <w:rPr>
-          <w:b/>
-          <w:lang w:eastAsia="ja-JP"/>
-        </w:rPr>
-        <w:t xml:space="preserve">2. </w:t>
-      </w:r>
-      <w:r>
-        <w:rPr>
-          <w:lang w:eastAsia="ja-JP"/>
-        </w:rPr>
-        <w:t>リコールがキャンセルされ、一覧から消えます。</w:t>
-      </w:r>
-    </w:p>
-    <w:p>
-      <w:pPr>
-        <w:ind w:left="567"/>
-        <w:rPr>
-          <w:lang w:eastAsia="ja-JP"/>
-        </w:rPr>
-      </w:pPr>
-      <w:r>
-        <w:rPr>
-          <w:lang w:eastAsia="ja-JP"/>
-        </w:rPr>
-        <w:t xml:space="preserve">💡 </w:t>
-      </w:r>
-      <w:r>
-        <w:rPr>
-          <w:color w:val="336699"/>
-          <w:sz w:val="19"/>
-          <w:lang w:eastAsia="ja-JP"/>
-        </w:rPr>
-        <w:t>「期限超過」タブのリコールは、できるだけ早く対応してください。</w:t>
-      </w:r>
-    </w:p>
-    <w:p>
-      <w:pPr>
-        <w:rPr>
-          <w:lang w:eastAsia="ja-JP"/>
-        </w:rPr>
-      </w:pPr>
-      <w:r>
-        <w:rPr>
-          <w:lang w:eastAsia="ja-JP"/>
-        </w:rPr>
-        <w:br w:type="page"/>
-      </w:r>
-    </w:p>
-    <w:p>
-      <w:pPr>
-        <w:pStyle w:val="1"/>
-        <w:rPr>
-          <w:lang w:eastAsia="ja-JP"/>
-        </w:rPr>
-      </w:pPr>
-      <w:r>
-        <w:rPr>
-          <w:lang w:eastAsia="ja-JP"/>
-        </w:rPr>
-        <w:lastRenderedPageBreak/>
-        <w:t xml:space="preserve">6. </w:t>
-      </w:r>
-      <w:r>
-        <w:rPr>
-          <w:lang w:eastAsia="ja-JP"/>
-        </w:rPr>
-        <w:t>案件管理</w:t>
-      </w:r>
-    </w:p>
-    <w:p>
-      <w:pPr>
-        <w:rPr>
-          <w:lang w:eastAsia="ja-JP"/>
-        </w:rPr>
-      </w:pPr>
-      <w:r>
-        <w:rPr>
-          <w:lang w:eastAsia="ja-JP"/>
-        </w:rPr>
-        <w:t>案件管理画面では、これまでに案件化した企業の一覧と詳細を確認できます。</w:t>
-      </w:r>
-    </w:p>
-    <w:p>
-      <w:pPr>
-        <w:pStyle w:val="21"/>
-        <w:rPr>
-          <w:lang w:eastAsia="ja-JP"/>
-        </w:rPr>
-      </w:pPr>
-      <w:r>
-        <w:rPr>
-          <w:lang w:eastAsia="ja-JP"/>
-        </w:rPr>
-        <w:t xml:space="preserve">6.1 </w:t>
-      </w:r>
-      <w:r>
-        <w:rPr>
-          <w:lang w:eastAsia="ja-JP"/>
-        </w:rPr>
-        <w:t>案件一覧の確認</w:t>
-      </w:r>
-    </w:p>
-    <w:p>
-      <w:pPr>
-        <w:ind w:left="567"/>
-        <w:rPr>
-          <w:lang w:eastAsia="ja-JP"/>
-        </w:rPr>
-      </w:pPr>
-      <w:r>
-        <w:rPr>
-          <w:b/>
-          <w:lang w:eastAsia="ja-JP"/>
-        </w:rPr>
-        <w:t xml:space="preserve">1. </w:t>
-      </w:r>
-      <w:r>
-        <w:rPr>
-          <w:lang w:eastAsia="ja-JP"/>
-        </w:rPr>
-        <w:t>案件管理画面を開いてください。案件の一覧が表示されます。</w:t>
-      </w:r>
-    </w:p>
-    <w:p>
-      <w:pPr>
-        <w:ind w:left="567"/>
-        <w:rPr>
-          <w:lang w:eastAsia="ja-JP"/>
-        </w:rPr>
-      </w:pPr>
-      <w:r>
-        <w:rPr>
-          <w:b/>
-          <w:lang w:eastAsia="ja-JP"/>
-        </w:rPr>
-        <w:t xml:space="preserve">2. </w:t>
-      </w:r>
-      <w:r>
-        <w:rPr>
-          <w:lang w:eastAsia="ja-JP"/>
-        </w:rPr>
-        <w:t>画面上部のフィルターで、ステータスや日付範囲を指定して絞り込むことができます。</w:t>
-      </w:r>
-    </w:p>
-    <w:p>
-      <w:pPr>
-        <w:ind w:left="567"/>
-        <w:rPr>
-          <w:lang w:eastAsia="ja-JP"/>
-        </w:rPr>
-      </w:pPr>
-      <w:r>
-        <w:rPr>
-          <w:b/>
-          <w:lang w:eastAsia="ja-JP"/>
-        </w:rPr>
-        <w:t xml:space="preserve">3. </w:t>
-      </w:r>
-      <w:r>
-        <w:rPr>
-          <w:lang w:eastAsia="ja-JP"/>
-        </w:rPr>
-        <w:t>確認したい案件の行をクリックすると、詳細画面が表示されます。</w:t>
-      </w:r>
-    </w:p>
-    <w:p>
-      <w:pPr>
-        <w:pStyle w:val="21"/>
-      </w:pPr>
-      <w:r>
-        <w:t xml:space="preserve">6.2 </w:t>
-      </w:r>
-      <w:proofErr w:type="spellStart"/>
-      <w:r>
-        <w:t>案件一覧のタブ</w:t>
-      </w:r>
-      <w:proofErr w:type="spellEnd"/>
     </w:p>
     <w:tbl>
       <w:tblPr>
@@ -4781,6 +4047,1347 @@
                 <w:color w:val="FFFFFF"/>
                 <w:sz w:val="19"/>
               </w:rPr>
+              <w:t>項目</w:t>
+            </w:r>
+          </w:p>
+        </w:tc>
+        <w:tc>
+          <w:tcPr>
+            <w:tcW w:w="6803" w:type="dxa"/>
+            <w:shd w:val="clear" w:color="auto" w:fill="1A478A"/>
+          </w:tcPr>
+          <w:p>
+            <w:pPr>
+              <w:jc w:val="center"/>
+            </w:pPr>
+            <w:r>
+              <w:rPr>
+                <w:b/>
+                <w:color w:val="FFFFFF"/>
+                <w:sz w:val="19"/>
+              </w:rPr>
+              <w:t>入力内容</w:t>
+            </w:r>
+          </w:p>
+        </w:tc>
+      </w:tr>
+      <w:tr>
+        <w:trPr>
+          <w:jc w:val="center"/>
+        </w:trPr>
+        <w:tc>
+          <w:tcPr>
+            <w:tcW w:w="2268" w:type="dxa"/>
+          </w:tcPr>
+          <w:p>
+            <w:r>
+              <w:rPr>
+                <w:sz w:val="19"/>
+              </w:rPr>
+              <w:t>ステータス</w:t>
+            </w:r>
+          </w:p>
+        </w:tc>
+        <w:tc>
+          <w:tcPr>
+            <w:tcW w:w="6803" w:type="dxa"/>
+          </w:tcPr>
+          <w:p>
+            <w:pPr>
+              <w:rPr>
+                <w:lang w:eastAsia="ja-JP"/>
+              </w:rPr>
+            </w:pPr>
+            <w:r>
+              <w:rPr>
+                <w:sz w:val="19"/>
+                <w:lang w:eastAsia="ja-JP"/>
+              </w:rPr>
+              <w:t>案件の現在の状態を選択</w:t>
+            </w:r>
+          </w:p>
+        </w:tc>
+      </w:tr>
+      <w:tr>
+        <w:trPr>
+          <w:jc w:val="center"/>
+        </w:trPr>
+        <w:tc>
+          <w:tcPr>
+            <w:tcW w:w="2268" w:type="dxa"/>
+            <w:shd w:val="clear" w:color="auto" w:fill="F0F4FA"/>
+          </w:tcPr>
+          <w:p>
+            <w:r>
+              <w:rPr>
+                <w:sz w:val="19"/>
+              </w:rPr>
+              <w:t>求人番号</w:t>
+            </w:r>
+          </w:p>
+        </w:tc>
+        <w:tc>
+          <w:tcPr>
+            <w:tcW w:w="6803" w:type="dxa"/>
+            <w:shd w:val="clear" w:color="auto" w:fill="F0F4FA"/>
+          </w:tcPr>
+          <w:p>
+            <w:pPr>
+              <w:rPr>
+                <w:lang w:eastAsia="ja-JP"/>
+              </w:rPr>
+            </w:pPr>
+            <w:r>
+              <w:rPr>
+                <w:sz w:val="19"/>
+                <w:lang w:eastAsia="ja-JP"/>
+              </w:rPr>
+              <w:t>ハローワークの求人番号</w:t>
+            </w:r>
+          </w:p>
+        </w:tc>
+      </w:tr>
+      <w:tr>
+        <w:trPr>
+          <w:jc w:val="center"/>
+        </w:trPr>
+        <w:tc>
+          <w:tcPr>
+            <w:tcW w:w="2268" w:type="dxa"/>
+          </w:tcPr>
+          <w:p>
+            <w:r>
+              <w:rPr>
+                <w:sz w:val="19"/>
+              </w:rPr>
+              <w:t>面談日</w:t>
+            </w:r>
+          </w:p>
+        </w:tc>
+        <w:tc>
+          <w:tcPr>
+            <w:tcW w:w="6803" w:type="dxa"/>
+          </w:tcPr>
+          <w:p>
+            <w:r>
+              <w:rPr>
+                <w:sz w:val="19"/>
+              </w:rPr>
+              <w:t>面談の予定日</w:t>
+            </w:r>
+          </w:p>
+        </w:tc>
+      </w:tr>
+      <w:tr>
+        <w:trPr>
+          <w:jc w:val="center"/>
+        </w:trPr>
+        <w:tc>
+          <w:tcPr>
+            <w:tcW w:w="2268" w:type="dxa"/>
+            <w:shd w:val="clear" w:color="auto" w:fill="F0F4FA"/>
+          </w:tcPr>
+          <w:p>
+            <w:r>
+              <w:rPr>
+                <w:sz w:val="19"/>
+              </w:rPr>
+              <w:t>面談種別</w:t>
+            </w:r>
+          </w:p>
+        </w:tc>
+        <w:tc>
+          <w:tcPr>
+            <w:tcW w:w="6803" w:type="dxa"/>
+            <w:shd w:val="clear" w:color="auto" w:fill="F0F4FA"/>
+          </w:tcPr>
+          <w:p>
+            <w:pPr>
+              <w:rPr>
+                <w:lang w:eastAsia="ja-JP"/>
+              </w:rPr>
+            </w:pPr>
+            <w:r>
+              <w:rPr>
+                <w:sz w:val="19"/>
+                <w:lang w:eastAsia="ja-JP"/>
+              </w:rPr>
+              <w:t>面談の方法（対面、オンラインなど）</w:t>
+            </w:r>
+          </w:p>
+        </w:tc>
+      </w:tr>
+      <w:tr>
+        <w:trPr>
+          <w:jc w:val="center"/>
+        </w:trPr>
+        <w:tc>
+          <w:tcPr>
+            <w:tcW w:w="2268" w:type="dxa"/>
+          </w:tcPr>
+          <w:p>
+            <w:r>
+              <w:rPr>
+                <w:sz w:val="19"/>
+              </w:rPr>
+              <w:t>企業担当者</w:t>
+            </w:r>
+          </w:p>
+        </w:tc>
+        <w:tc>
+          <w:tcPr>
+            <w:tcW w:w="6803" w:type="dxa"/>
+          </w:tcPr>
+          <w:p>
+            <w:r>
+              <w:rPr>
+                <w:sz w:val="19"/>
+              </w:rPr>
+              <w:t>企業側の担当者名</w:t>
+            </w:r>
+          </w:p>
+        </w:tc>
+      </w:tr>
+      <w:tr>
+        <w:trPr>
+          <w:jc w:val="center"/>
+        </w:trPr>
+        <w:tc>
+          <w:tcPr>
+            <w:tcW w:w="2268" w:type="dxa"/>
+            <w:shd w:val="clear" w:color="auto" w:fill="F0F4FA"/>
+          </w:tcPr>
+          <w:p>
+            <w:r>
+              <w:rPr>
+                <w:sz w:val="19"/>
+              </w:rPr>
+              <w:t>連絡先</w:t>
+            </w:r>
+          </w:p>
+        </w:tc>
+        <w:tc>
+          <w:tcPr>
+            <w:tcW w:w="6803" w:type="dxa"/>
+            <w:shd w:val="clear" w:color="auto" w:fill="F0F4FA"/>
+          </w:tcPr>
+          <w:p>
+            <w:r>
+              <w:rPr>
+                <w:sz w:val="19"/>
+              </w:rPr>
+              <w:t>企業の連絡先情報</w:t>
+            </w:r>
+          </w:p>
+        </w:tc>
+      </w:tr>
+      <w:tr>
+        <w:trPr>
+          <w:jc w:val="center"/>
+        </w:trPr>
+        <w:tc>
+          <w:tcPr>
+            <w:tcW w:w="2268" w:type="dxa"/>
+          </w:tcPr>
+          <w:p>
+            <w:pPr>
+              <w:rPr>
+                <w:lang w:eastAsia="ja-JP"/>
+              </w:rPr>
+            </w:pPr>
+            <w:r>
+              <w:rPr>
+                <w:sz w:val="19"/>
+                <w:lang w:eastAsia="ja-JP"/>
+              </w:rPr>
+              <w:lastRenderedPageBreak/>
+              <w:t>各種チェックボックス</w:t>
+            </w:r>
+          </w:p>
+        </w:tc>
+        <w:tc>
+          <w:tcPr>
+            <w:tcW w:w="6803" w:type="dxa"/>
+          </w:tcPr>
+          <w:p>
+            <w:pPr>
+              <w:rPr>
+                <w:lang w:eastAsia="ja-JP"/>
+              </w:rPr>
+            </w:pPr>
+            <w:r>
+              <w:rPr>
+                <w:sz w:val="19"/>
+                <w:lang w:eastAsia="ja-JP"/>
+              </w:rPr>
+              <w:t>該当する項目にチェック</w:t>
+            </w:r>
+          </w:p>
+        </w:tc>
+      </w:tr>
+    </w:tbl>
+    <w:p>
+      <w:pPr>
+        <w:pStyle w:val="21"/>
+        <w:rPr>
+          <w:lang w:eastAsia="ja-JP"/>
+        </w:rPr>
+      </w:pPr>
+      <w:r>
+        <w:rPr>
+          <w:lang w:eastAsia="ja-JP"/>
+        </w:rPr>
+        <w:t xml:space="preserve">4.8 </w:t>
+      </w:r>
+      <w:r>
+        <w:rPr>
+          <w:lang w:eastAsia="ja-JP"/>
+        </w:rPr>
+        <w:t>スクリプト・切り返しトーク</w:t>
+      </w:r>
+    </w:p>
+    <w:p>
+      <w:pPr>
+        <w:rPr>
+          <w:lang w:eastAsia="ja-JP"/>
+        </w:rPr>
+      </w:pPr>
+      <w:r>
+        <w:rPr>
+          <w:lang w:eastAsia="ja-JP"/>
+        </w:rPr>
+        <w:t>架電中に使えるトークスクリプトやQ&amp;Aを検索できます：</w:t>
+      </w:r>
+    </w:p>
+    <w:p>
+      <w:pPr>
+        <w:ind w:left="567"/>
+        <w:rPr>
+          <w:lang w:eastAsia="ja-JP"/>
+        </w:rPr>
+      </w:pPr>
+      <w:r>
+        <w:rPr>
+          <w:b/>
+          <w:lang w:eastAsia="ja-JP"/>
+        </w:rPr>
+        <w:t xml:space="preserve">1. </w:t>
+      </w:r>
+      <w:r>
+        <w:rPr>
+          <w:lang w:eastAsia="ja-JP"/>
+        </w:rPr>
+        <w:t>スクリプトパネルを開いてください。</w:t>
+      </w:r>
+    </w:p>
+    <w:p>
+      <w:pPr>
+        <w:ind w:left="567"/>
+        <w:rPr>
+          <w:lang w:eastAsia="ja-JP"/>
+        </w:rPr>
+      </w:pPr>
+      <w:r>
+        <w:rPr>
+          <w:b/>
+          <w:lang w:eastAsia="ja-JP"/>
+        </w:rPr>
+        <w:t xml:space="preserve">2. </w:t>
+      </w:r>
+      <w:r>
+        <w:rPr>
+          <w:lang w:eastAsia="ja-JP"/>
+        </w:rPr>
+        <w:t>キーワードまたは業種で検索してください。</w:t>
+      </w:r>
+    </w:p>
+    <w:p>
+      <w:pPr>
+        <w:ind w:left="567"/>
+        <w:rPr>
+          <w:lang w:eastAsia="ja-JP"/>
+        </w:rPr>
+      </w:pPr>
+      <w:r>
+        <w:rPr>
+          <w:b/>
+          <w:lang w:eastAsia="ja-JP"/>
+        </w:rPr>
+        <w:t xml:space="preserve">3. </w:t>
+      </w:r>
+      <w:r>
+        <w:rPr>
+          <w:lang w:eastAsia="ja-JP"/>
+        </w:rPr>
+        <w:t>該当するトークスクリプトやQ&amp;Aが表示されます。</w:t>
+      </w:r>
+    </w:p>
+    <w:p>
+      <w:pPr>
+        <w:ind w:left="567"/>
+        <w:rPr>
+          <w:color w:val="336699"/>
+          <w:sz w:val="19"/>
+          <w:lang w:eastAsia="ja-JP"/>
+        </w:rPr>
+      </w:pPr>
+      <w:r>
+        <w:rPr>
+          <w:lang w:eastAsia="ja-JP"/>
+        </w:rPr>
+        <w:t xml:space="preserve">💡 </w:t>
+      </w:r>
+      <w:r>
+        <w:rPr>
+          <w:color w:val="336699"/>
+          <w:sz w:val="19"/>
+          <w:lang w:eastAsia="ja-JP"/>
+        </w:rPr>
+        <w:t>よくある質問への回答や、断られたときの切り返しトークを確認できます。</w:t>
+      </w:r>
+    </w:p>
+    <w:p>
+      <w:pPr>
+        <w:ind w:left="567"/>
+        <w:rPr>
+          <w:rFonts w:hint="eastAsia"/>
+          <w:lang w:eastAsia="ja-JP"/>
+        </w:rPr>
+      </w:pPr>
+      <w:r>
+        <w:rPr>
+          <w:lang w:eastAsia="ja-JP"/>
+        </w:rPr>
+        <w:drawing>
+          <wp:inline distT="0" distB="0" distL="0" distR="0" wp14:anchorId="42E9810F" wp14:editId="7E94F544">
+            <wp:extent cx="5760720" cy="2922905"/>
+            <wp:effectExtent l="0" t="0" r="0" b="0"/>
+            <wp:docPr id="1787918240" name="図 1"/>
+            <wp:cNvGraphicFramePr>
+              <a:graphicFrameLocks xmlns:a="http://schemas.openxmlformats.org/drawingml/2006/main" noChangeAspect="1"/>
+            </wp:cNvGraphicFramePr>
+            <a:graphic xmlns:a="http://schemas.openxmlformats.org/drawingml/2006/main">
+              <a:graphicData uri="http://schemas.openxmlformats.org/drawingml/2006/picture">
+                <pic:pic xmlns:pic="http://schemas.openxmlformats.org/drawingml/2006/picture">
+                  <pic:nvPicPr>
+                    <pic:cNvPr id="1787918240" name=""/>
+                    <pic:cNvPicPr/>
+                  </pic:nvPicPr>
+                  <pic:blipFill>
+                    <a:blip r:embed="rId18"/>
+                    <a:stretch>
+                      <a:fillRect/>
+                    </a:stretch>
+                  </pic:blipFill>
+                  <pic:spPr>
+                    <a:xfrm>
+                      <a:off x="0" y="0"/>
+                      <a:ext cx="5760720" cy="2922905"/>
+                    </a:xfrm>
+                    <a:prstGeom prst="rect">
+                      <a:avLst/>
+                    </a:prstGeom>
+                  </pic:spPr>
+                </pic:pic>
+              </a:graphicData>
+            </a:graphic>
+          </wp:inline>
+        </w:drawing>
+      </w:r>
+    </w:p>
+    <w:p>
+      <w:pPr>
+        <w:rPr>
+          <w:lang w:eastAsia="ja-JP"/>
+        </w:rPr>
+      </w:pPr>
+      <w:r>
+        <w:rPr>
+          <w:lang w:eastAsia="ja-JP"/>
+        </w:rPr>
+        <w:br w:type="page"/>
+      </w:r>
+    </w:p>
+    <w:p>
+      <w:pPr>
+        <w:pStyle w:val="1"/>
+        <w:rPr>
+          <w:lang w:eastAsia="ja-JP"/>
+        </w:rPr>
+      </w:pPr>
+      <w:r>
+        <w:rPr>
+          <w:lang w:eastAsia="ja-JP"/>
+        </w:rPr>
+        <w:lastRenderedPageBreak/>
+        <w:t xml:space="preserve">5. </w:t>
+      </w:r>
+      <w:r>
+        <w:rPr>
+          <w:lang w:eastAsia="ja-JP"/>
+        </w:rPr>
+        <w:t>リコール管理</w:t>
+      </w:r>
+    </w:p>
+    <w:p>
+      <w:pPr>
+        <w:rPr>
+          <w:lang w:eastAsia="ja-JP"/>
+        </w:rPr>
+      </w:pPr>
+      <w:r>
+        <w:rPr>
+          <w:lang w:eastAsia="ja-JP"/>
+        </w:rPr>
+        <w:t>リコール管理画面では、再架電の予定を一覧で確認・管理できます。</w:t>
+      </w:r>
+    </w:p>
+    <w:p>
+      <w:pPr>
+        <w:rPr>
+          <w:rFonts w:hint="eastAsia"/>
+          <w:lang w:eastAsia="ja-JP"/>
+        </w:rPr>
+      </w:pPr>
+      <w:r>
+        <w:rPr>
+          <w:lang w:eastAsia="ja-JP"/>
+        </w:rPr>
+        <w:drawing>
+          <wp:inline distT="0" distB="0" distL="0" distR="0" wp14:anchorId="33003DF6" wp14:editId="0CAD8F13">
+            <wp:extent cx="5760720" cy="2583815"/>
+            <wp:effectExtent l="0" t="0" r="0" b="6985"/>
+            <wp:docPr id="2095229615" name="図 1"/>
+            <wp:cNvGraphicFramePr>
+              <a:graphicFrameLocks xmlns:a="http://schemas.openxmlformats.org/drawingml/2006/main" noChangeAspect="1"/>
+            </wp:cNvGraphicFramePr>
+            <a:graphic xmlns:a="http://schemas.openxmlformats.org/drawingml/2006/main">
+              <a:graphicData uri="http://schemas.openxmlformats.org/drawingml/2006/picture">
+                <pic:pic xmlns:pic="http://schemas.openxmlformats.org/drawingml/2006/picture">
+                  <pic:nvPicPr>
+                    <pic:cNvPr id="2095229615" name=""/>
+                    <pic:cNvPicPr/>
+                  </pic:nvPicPr>
+                  <pic:blipFill>
+                    <a:blip r:embed="rId19"/>
+                    <a:stretch>
+                      <a:fillRect/>
+                    </a:stretch>
+                  </pic:blipFill>
+                  <pic:spPr>
+                    <a:xfrm>
+                      <a:off x="0" y="0"/>
+                      <a:ext cx="5760720" cy="2583815"/>
+                    </a:xfrm>
+                    <a:prstGeom prst="rect">
+                      <a:avLst/>
+                    </a:prstGeom>
+                  </pic:spPr>
+                </pic:pic>
+              </a:graphicData>
+            </a:graphic>
+          </wp:inline>
+        </w:drawing>
+      </w:r>
+    </w:p>
+    <w:p>
+      <w:pPr>
+        <w:pStyle w:val="21"/>
+        <w:rPr>
+          <w:lang w:eastAsia="ja-JP"/>
+        </w:rPr>
+      </w:pPr>
+      <w:r>
+        <w:rPr>
+          <w:lang w:eastAsia="ja-JP"/>
+        </w:rPr>
+        <w:t xml:space="preserve">5.1 </w:t>
+      </w:r>
+      <w:r>
+        <w:rPr>
+          <w:lang w:eastAsia="ja-JP"/>
+        </w:rPr>
+        <w:t>リコール一覧の確認</w:t>
+      </w:r>
+    </w:p>
+    <w:p>
+      <w:pPr>
+        <w:rPr>
+          <w:lang w:eastAsia="ja-JP"/>
+        </w:rPr>
+      </w:pPr>
+      <w:r>
+        <w:rPr>
+          <w:lang w:eastAsia="ja-JP"/>
+        </w:rPr>
+        <w:t>画面上部のタブで、リコールを期間別に確認できます：</w:t>
+      </w:r>
+    </w:p>
+    <w:tbl>
+      <w:tblPr>
+        <w:tblStyle w:val="afe"/>
+        <w:tblW w:w="0" w:type="auto"/>
+        <w:jc w:val="center"/>
+        <w:tblLook w:val="04A0" w:firstRow="1" w:lastRow="0" w:firstColumn="1" w:lastColumn="0" w:noHBand="0" w:noVBand="1"/>
+      </w:tblPr>
+      <w:tblGrid>
+        <w:gridCol w:w="1701"/>
+        <w:gridCol w:w="7370"/>
+      </w:tblGrid>
+      <w:tr>
+        <w:trPr>
+          <w:jc w:val="center"/>
+        </w:trPr>
+        <w:tc>
+          <w:tcPr>
+            <w:tcW w:w="1701" w:type="dxa"/>
+            <w:shd w:val="clear" w:color="auto" w:fill="1A478A"/>
+          </w:tcPr>
+          <w:p>
+            <w:pPr>
+              <w:jc w:val="center"/>
+            </w:pPr>
+            <w:r>
+              <w:rPr>
+                <w:b/>
+                <w:color w:val="FFFFFF"/>
+                <w:sz w:val="19"/>
+              </w:rPr>
+              <w:t>タブ名</w:t>
+            </w:r>
+          </w:p>
+        </w:tc>
+        <w:tc>
+          <w:tcPr>
+            <w:tcW w:w="7370" w:type="dxa"/>
+            <w:shd w:val="clear" w:color="auto" w:fill="1A478A"/>
+          </w:tcPr>
+          <w:p>
+            <w:pPr>
+              <w:jc w:val="center"/>
+            </w:pPr>
+            <w:r>
+              <w:rPr>
+                <w:b/>
+                <w:color w:val="FFFFFF"/>
+                <w:sz w:val="19"/>
+              </w:rPr>
+              <w:t>内容</w:t>
+            </w:r>
+          </w:p>
+        </w:tc>
+      </w:tr>
+      <w:tr>
+        <w:trPr>
+          <w:jc w:val="center"/>
+        </w:trPr>
+        <w:tc>
+          <w:tcPr>
+            <w:tcW w:w="1701" w:type="dxa"/>
+          </w:tcPr>
+          <w:p>
+            <w:r>
+              <w:rPr>
+                <w:sz w:val="19"/>
+              </w:rPr>
+              <w:t>今日</w:t>
+            </w:r>
+          </w:p>
+        </w:tc>
+        <w:tc>
+          <w:tcPr>
+            <w:tcW w:w="7370" w:type="dxa"/>
+          </w:tcPr>
+          <w:p>
+            <w:r>
+              <w:rPr>
+                <w:sz w:val="19"/>
+              </w:rPr>
+              <w:t>本日予定のリコール</w:t>
+            </w:r>
+          </w:p>
+        </w:tc>
+      </w:tr>
+      <w:tr>
+        <w:trPr>
+          <w:jc w:val="center"/>
+        </w:trPr>
+        <w:tc>
+          <w:tcPr>
+            <w:tcW w:w="1701" w:type="dxa"/>
+            <w:shd w:val="clear" w:color="auto" w:fill="F0F4FA"/>
+          </w:tcPr>
+          <w:p>
+            <w:r>
+              <w:rPr>
+                <w:sz w:val="19"/>
+              </w:rPr>
+              <w:t>明日</w:t>
+            </w:r>
+          </w:p>
+        </w:tc>
+        <w:tc>
+          <w:tcPr>
+            <w:tcW w:w="7370" w:type="dxa"/>
+            <w:shd w:val="clear" w:color="auto" w:fill="F0F4FA"/>
+          </w:tcPr>
+          <w:p>
+            <w:r>
+              <w:rPr>
+                <w:sz w:val="19"/>
+              </w:rPr>
+              <w:t>明日予定のリコール</w:t>
+            </w:r>
+          </w:p>
+        </w:tc>
+      </w:tr>
+      <w:tr>
+        <w:trPr>
+          <w:jc w:val="center"/>
+        </w:trPr>
+        <w:tc>
+          <w:tcPr>
+            <w:tcW w:w="1701" w:type="dxa"/>
+          </w:tcPr>
+          <w:p>
+            <w:r>
+              <w:rPr>
+                <w:sz w:val="19"/>
+              </w:rPr>
+              <w:t>期限超過</w:t>
+            </w:r>
+          </w:p>
+        </w:tc>
+        <w:tc>
+          <w:tcPr>
+            <w:tcW w:w="7370" w:type="dxa"/>
+          </w:tcPr>
+          <w:p>
+            <w:pPr>
+              <w:rPr>
+                <w:lang w:eastAsia="ja-JP"/>
+              </w:rPr>
+            </w:pPr>
+            <w:r>
+              <w:rPr>
+                <w:sz w:val="19"/>
+                <w:lang w:eastAsia="ja-JP"/>
+              </w:rPr>
+              <w:t>予定日を過ぎたリコール（早めに対応してください）</w:t>
+            </w:r>
+          </w:p>
+        </w:tc>
+      </w:tr>
+      <w:tr>
+        <w:trPr>
+          <w:jc w:val="center"/>
+        </w:trPr>
+        <w:tc>
+          <w:tcPr>
+            <w:tcW w:w="1701" w:type="dxa"/>
+            <w:shd w:val="clear" w:color="auto" w:fill="F0F4FA"/>
+          </w:tcPr>
+          <w:p>
+            <w:r>
+              <w:rPr>
+                <w:sz w:val="19"/>
+              </w:rPr>
+              <w:t>その他</w:t>
+            </w:r>
+          </w:p>
+        </w:tc>
+        <w:tc>
+          <w:tcPr>
+            <w:tcW w:w="7370" w:type="dxa"/>
+            <w:shd w:val="clear" w:color="auto" w:fill="F0F4FA"/>
+          </w:tcPr>
+          <w:p>
+            <w:pPr>
+              <w:rPr>
+                <w:lang w:eastAsia="ja-JP"/>
+              </w:rPr>
+            </w:pPr>
+            <w:r>
+              <w:rPr>
+                <w:sz w:val="19"/>
+                <w:lang w:eastAsia="ja-JP"/>
+              </w:rPr>
+              <w:t>明後日以降のリコール</w:t>
+            </w:r>
+          </w:p>
+        </w:tc>
+      </w:tr>
+    </w:tbl>
+    <w:p>
+      <w:pPr>
+        <w:rPr>
+          <w:lang w:eastAsia="ja-JP"/>
+        </w:rPr>
+      </w:pPr>
+      <w:r>
+        <w:rPr>
+          <w:lang w:eastAsia="ja-JP"/>
+        </w:rPr>
+        <w:t>各リコールには以下の情報が表示されます：</w:t>
+      </w:r>
+    </w:p>
+    <w:p>
+      <w:pPr>
+        <w:ind w:left="567" w:hanging="283"/>
+        <w:rPr>
+          <w:lang w:eastAsia="ja-JP"/>
+        </w:rPr>
+      </w:pPr>
+      <w:r>
+        <w:rPr>
+          <w:lang w:eastAsia="ja-JP"/>
+        </w:rPr>
+        <w:t>・企業名</w:t>
+      </w:r>
+    </w:p>
+    <w:p>
+      <w:pPr>
+        <w:ind w:left="567" w:hanging="283"/>
+        <w:rPr>
+          <w:lang w:eastAsia="ja-JP"/>
+        </w:rPr>
+      </w:pPr>
+      <w:r>
+        <w:rPr>
+          <w:lang w:eastAsia="ja-JP"/>
+        </w:rPr>
+        <w:t>・電話番号</w:t>
+      </w:r>
+    </w:p>
+    <w:p>
+      <w:pPr>
+        <w:ind w:left="567" w:hanging="283"/>
+        <w:rPr>
+          <w:lang w:eastAsia="ja-JP"/>
+        </w:rPr>
+      </w:pPr>
+      <w:r>
+        <w:rPr>
+          <w:lang w:eastAsia="ja-JP"/>
+        </w:rPr>
+        <w:t>・業種</w:t>
+      </w:r>
+    </w:p>
+    <w:p>
+      <w:pPr>
+        <w:ind w:left="567" w:hanging="283"/>
+        <w:rPr>
+          <w:lang w:eastAsia="ja-JP"/>
+        </w:rPr>
+      </w:pPr>
+      <w:r>
+        <w:rPr>
+          <w:lang w:eastAsia="ja-JP"/>
+        </w:rPr>
+        <w:t>・リコール予定日時</w:t>
+      </w:r>
+    </w:p>
+    <w:p>
+      <w:pPr>
+        <w:ind w:left="567" w:hanging="283"/>
+        <w:rPr>
+          <w:lang w:eastAsia="ja-JP"/>
+        </w:rPr>
+      </w:pPr>
+      <w:r>
+        <w:rPr>
+          <w:lang w:eastAsia="ja-JP"/>
+        </w:rPr>
+        <w:t>・前回のメモ</w:t>
+      </w:r>
+    </w:p>
+    <w:p>
+      <w:pPr>
+        <w:pStyle w:val="21"/>
+        <w:rPr>
+          <w:lang w:eastAsia="ja-JP"/>
+        </w:rPr>
+      </w:pPr>
+      <w:r>
+        <w:rPr>
+          <w:lang w:eastAsia="ja-JP"/>
+        </w:rPr>
+        <w:lastRenderedPageBreak/>
+        <w:t xml:space="preserve">5.2 </w:t>
+      </w:r>
+      <w:r>
+        <w:rPr>
+          <w:lang w:eastAsia="ja-JP"/>
+        </w:rPr>
+        <w:t>リコールの操作</w:t>
+      </w:r>
+    </w:p>
+    <w:p>
+      <w:pPr>
+        <w:rPr>
+          <w:lang w:eastAsia="ja-JP"/>
+        </w:rPr>
+      </w:pPr>
+      <w:r>
+        <w:rPr>
+          <w:lang w:eastAsia="ja-JP"/>
+        </w:rPr>
+        <w:t>■ 架電画面に移動する</w:t>
+      </w:r>
+    </w:p>
+    <w:p>
+      <w:pPr>
+        <w:ind w:left="567"/>
+        <w:rPr>
+          <w:lang w:eastAsia="ja-JP"/>
+        </w:rPr>
+      </w:pPr>
+      <w:r>
+        <w:rPr>
+          <w:b/>
+          <w:lang w:eastAsia="ja-JP"/>
+        </w:rPr>
+        <w:t xml:space="preserve">1. </w:t>
+      </w:r>
+      <w:r>
+        <w:rPr>
+          <w:lang w:eastAsia="ja-JP"/>
+        </w:rPr>
+        <w:t>リコール一覧から、架電したい企業をクリックしてください。</w:t>
+      </w:r>
+    </w:p>
+    <w:p>
+      <w:pPr>
+        <w:ind w:left="567"/>
+        <w:rPr>
+          <w:lang w:eastAsia="ja-JP"/>
+        </w:rPr>
+      </w:pPr>
+      <w:r>
+        <w:rPr>
+          <w:b/>
+          <w:lang w:eastAsia="ja-JP"/>
+        </w:rPr>
+        <w:t xml:space="preserve">2. </w:t>
+      </w:r>
+      <w:r>
+        <w:rPr>
+          <w:lang w:eastAsia="ja-JP"/>
+        </w:rPr>
+        <w:t>架電画面に移動し、その企業が選択された状態になります。</w:t>
+      </w:r>
+    </w:p>
+    <w:p>
+      <w:pPr>
+        <w:rPr>
+          <w:lang w:eastAsia="ja-JP"/>
+        </w:rPr>
+      </w:pPr>
+      <w:r>
+        <w:rPr>
+          <w:lang w:eastAsia="ja-JP"/>
+        </w:rPr>
+        <w:t>■ リコールを完了にする</w:t>
+      </w:r>
+    </w:p>
+    <w:p>
+      <w:pPr>
+        <w:ind w:left="567"/>
+        <w:rPr>
+          <w:lang w:eastAsia="ja-JP"/>
+        </w:rPr>
+      </w:pPr>
+      <w:r>
+        <w:rPr>
+          <w:b/>
+          <w:lang w:eastAsia="ja-JP"/>
+        </w:rPr>
+        <w:t xml:space="preserve">1. </w:t>
+      </w:r>
+      <w:r>
+        <w:rPr>
+          <w:lang w:eastAsia="ja-JP"/>
+        </w:rPr>
+        <w:t>対象のリコールの「完了」ボタンをクリックしてください。</w:t>
+      </w:r>
+    </w:p>
+    <w:p>
+      <w:pPr>
+        <w:ind w:left="567"/>
+        <w:rPr>
+          <w:rFonts w:hint="eastAsia"/>
+          <w:lang w:eastAsia="ja-JP"/>
+        </w:rPr>
+      </w:pPr>
+      <w:r>
+        <w:rPr>
+          <w:b/>
+          <w:lang w:eastAsia="ja-JP"/>
+        </w:rPr>
+        <w:t xml:space="preserve">2. </w:t>
+      </w:r>
+      <w:r>
+        <w:rPr>
+          <w:lang w:eastAsia="ja-JP"/>
+        </w:rPr>
+        <w:t>リコールが完了状態になり、一覧から消えます。</w:t>
+      </w:r>
+      <w:r>
+        <w:rPr>
+          <w:lang w:eastAsia="ja-JP"/>
+        </w:rPr>
+        <w:br/>
+      </w:r>
+      <w:r>
+        <w:rPr>
+          <w:rFonts w:hint="eastAsia"/>
+          <w:b/>
+          <w:bCs/>
+          <w:color w:val="EE0000"/>
+          <w:lang w:eastAsia="ja-JP"/>
+        </w:rPr>
+        <w:t>※</w:t>
+      </w:r>
+      <w:r>
+        <w:rPr>
+          <w:rFonts w:hint="eastAsia"/>
+          <w:b/>
+          <w:bCs/>
+          <w:color w:val="EE0000"/>
+          <w:lang w:eastAsia="ja-JP"/>
+        </w:rPr>
+        <w:t xml:space="preserve"> </w:t>
+      </w:r>
+      <w:r>
+        <w:rPr>
+          <w:rFonts w:hint="eastAsia"/>
+          <w:b/>
+          <w:bCs/>
+          <w:color w:val="EE0000"/>
+          <w:lang w:eastAsia="ja-JP"/>
+        </w:rPr>
+        <w:t>完了ボタンを押さないと</w:t>
+      </w:r>
+      <w:r>
+        <w:rPr>
+          <w:rFonts w:hint="eastAsia"/>
+          <w:b/>
+          <w:bCs/>
+          <w:color w:val="EE0000"/>
+          <w:lang w:eastAsia="ja-JP"/>
+        </w:rPr>
+        <w:t>架電リストに何度も表示されてしまいます。</w:t>
+      </w:r>
+    </w:p>
+    <w:p>
+      <w:pPr>
+        <w:rPr>
+          <w:lang w:eastAsia="ja-JP"/>
+        </w:rPr>
+      </w:pPr>
+      <w:r>
+        <w:rPr>
+          <w:lang w:eastAsia="ja-JP"/>
+        </w:rPr>
+        <w:t>■ リコールをキャンセルする</w:t>
+      </w:r>
+    </w:p>
+    <w:p>
+      <w:pPr>
+        <w:ind w:left="567"/>
+        <w:rPr>
+          <w:lang w:eastAsia="ja-JP"/>
+        </w:rPr>
+      </w:pPr>
+      <w:r>
+        <w:rPr>
+          <w:b/>
+          <w:lang w:eastAsia="ja-JP"/>
+        </w:rPr>
+        <w:t xml:space="preserve">1. </w:t>
+      </w:r>
+      <w:r>
+        <w:rPr>
+          <w:lang w:eastAsia="ja-JP"/>
+        </w:rPr>
+        <w:t>対象のリコールの「</w:t>
+      </w:r>
+      <w:r>
+        <w:rPr>
+          <w:rFonts w:hint="eastAsia"/>
+          <w:lang w:eastAsia="ja-JP"/>
+        </w:rPr>
+        <w:t>取消</w:t>
+      </w:r>
+      <w:r>
+        <w:rPr>
+          <w:lang w:eastAsia="ja-JP"/>
+        </w:rPr>
+        <w:t>」ボタンをクリックしてください。</w:t>
+      </w:r>
+    </w:p>
+    <w:p>
+      <w:pPr>
+        <w:ind w:left="567"/>
+        <w:rPr>
+          <w:lang w:eastAsia="ja-JP"/>
+        </w:rPr>
+      </w:pPr>
+      <w:r>
+        <w:rPr>
+          <w:b/>
+          <w:lang w:eastAsia="ja-JP"/>
+        </w:rPr>
+        <w:t xml:space="preserve">2. </w:t>
+      </w:r>
+      <w:r>
+        <w:rPr>
+          <w:lang w:eastAsia="ja-JP"/>
+        </w:rPr>
+        <w:t>リコールがキャンセルされ、一覧から消えます。</w:t>
+      </w:r>
+    </w:p>
+    <w:p>
+      <w:pPr>
+        <w:ind w:left="567"/>
+        <w:rPr>
+          <w:lang w:eastAsia="ja-JP"/>
+        </w:rPr>
+      </w:pPr>
+      <w:r>
+        <w:rPr>
+          <w:lang w:eastAsia="ja-JP"/>
+        </w:rPr>
+        <w:t xml:space="preserve">💡 </w:t>
+      </w:r>
+      <w:r>
+        <w:rPr>
+          <w:color w:val="336699"/>
+          <w:sz w:val="19"/>
+          <w:lang w:eastAsia="ja-JP"/>
+        </w:rPr>
+        <w:t>「期限超過」タブのリコールは、できるだけ早く対応してください。</w:t>
+      </w:r>
+    </w:p>
+    <w:p>
+      <w:pPr>
+        <w:rPr>
+          <w:lang w:eastAsia="ja-JP"/>
+        </w:rPr>
+      </w:pPr>
+      <w:r>
+        <w:rPr>
+          <w:lang w:eastAsia="ja-JP"/>
+        </w:rPr>
+        <w:br w:type="page"/>
+      </w:r>
+    </w:p>
+    <w:p>
+      <w:pPr>
+        <w:pStyle w:val="1"/>
+        <w:rPr>
+          <w:lang w:eastAsia="ja-JP"/>
+        </w:rPr>
+      </w:pPr>
+      <w:r>
+        <w:rPr>
+          <w:lang w:eastAsia="ja-JP"/>
+        </w:rPr>
+        <w:lastRenderedPageBreak/>
+        <w:t xml:space="preserve">6. </w:t>
+      </w:r>
+      <w:r>
+        <w:rPr>
+          <w:lang w:eastAsia="ja-JP"/>
+        </w:rPr>
+        <w:t>案件管理</w:t>
+      </w:r>
+    </w:p>
+    <w:p>
+      <w:pPr>
+        <w:rPr>
+          <w:lang w:eastAsia="ja-JP"/>
+        </w:rPr>
+      </w:pPr>
+      <w:r>
+        <w:rPr>
+          <w:lang w:eastAsia="ja-JP"/>
+        </w:rPr>
+        <w:t>案件管理画面では、これまでに案件化した企業の一覧と詳細を確認できます。</w:t>
+      </w:r>
+    </w:p>
+    <w:p>
+      <w:pPr>
+        <w:rPr>
+          <w:rFonts w:hint="eastAsia"/>
+          <w:lang w:eastAsia="ja-JP"/>
+        </w:rPr>
+      </w:pPr>
+      <w:r>
+        <w:rPr>
+          <w:lang w:eastAsia="ja-JP"/>
+        </w:rPr>
+        <w:drawing>
+          <wp:inline distT="0" distB="0" distL="0" distR="0" wp14:anchorId="29CE9809" wp14:editId="5EE9CB2F">
+            <wp:extent cx="5760720" cy="2208530"/>
+            <wp:effectExtent l="0" t="0" r="0" b="1270"/>
+            <wp:docPr id="930388033" name="図 1"/>
+            <wp:cNvGraphicFramePr>
+              <a:graphicFrameLocks xmlns:a="http://schemas.openxmlformats.org/drawingml/2006/main" noChangeAspect="1"/>
+            </wp:cNvGraphicFramePr>
+            <a:graphic xmlns:a="http://schemas.openxmlformats.org/drawingml/2006/main">
+              <a:graphicData uri="http://schemas.openxmlformats.org/drawingml/2006/picture">
+                <pic:pic xmlns:pic="http://schemas.openxmlformats.org/drawingml/2006/picture">
+                  <pic:nvPicPr>
+                    <pic:cNvPr id="930388033" name=""/>
+                    <pic:cNvPicPr/>
+                  </pic:nvPicPr>
+                  <pic:blipFill>
+                    <a:blip r:embed="rId20"/>
+                    <a:stretch>
+                      <a:fillRect/>
+                    </a:stretch>
+                  </pic:blipFill>
+                  <pic:spPr>
+                    <a:xfrm>
+                      <a:off x="0" y="0"/>
+                      <a:ext cx="5760720" cy="2208530"/>
+                    </a:xfrm>
+                    <a:prstGeom prst="rect">
+                      <a:avLst/>
+                    </a:prstGeom>
+                  </pic:spPr>
+                </pic:pic>
+              </a:graphicData>
+            </a:graphic>
+          </wp:inline>
+        </w:drawing>
+      </w:r>
+    </w:p>
+    <w:p>
+      <w:pPr>
+        <w:pStyle w:val="21"/>
+        <w:rPr>
+          <w:lang w:eastAsia="ja-JP"/>
+        </w:rPr>
+      </w:pPr>
+      <w:r>
+        <w:rPr>
+          <w:lang w:eastAsia="ja-JP"/>
+        </w:rPr>
+        <w:t xml:space="preserve">6.1 </w:t>
+      </w:r>
+      <w:r>
+        <w:rPr>
+          <w:lang w:eastAsia="ja-JP"/>
+        </w:rPr>
+        <w:t>案件一覧の確認</w:t>
+      </w:r>
+    </w:p>
+    <w:p>
+      <w:pPr>
+        <w:ind w:left="567"/>
+        <w:rPr>
+          <w:lang w:eastAsia="ja-JP"/>
+        </w:rPr>
+      </w:pPr>
+      <w:r>
+        <w:rPr>
+          <w:b/>
+          <w:lang w:eastAsia="ja-JP"/>
+        </w:rPr>
+        <w:t xml:space="preserve">1. </w:t>
+      </w:r>
+      <w:r>
+        <w:rPr>
+          <w:lang w:eastAsia="ja-JP"/>
+        </w:rPr>
+        <w:t>案件管理画面を開いてください。案件の一覧が表示されます。</w:t>
+      </w:r>
+    </w:p>
+    <w:p>
+      <w:pPr>
+        <w:ind w:left="567"/>
+        <w:rPr>
+          <w:lang w:eastAsia="ja-JP"/>
+        </w:rPr>
+      </w:pPr>
+      <w:r>
+        <w:rPr>
+          <w:b/>
+          <w:lang w:eastAsia="ja-JP"/>
+        </w:rPr>
+        <w:t xml:space="preserve">2. </w:t>
+      </w:r>
+      <w:r>
+        <w:rPr>
+          <w:lang w:eastAsia="ja-JP"/>
+        </w:rPr>
+        <w:t>画面上部のフィルターで、ステータスや日付範囲を指定して絞り込むことができます。</w:t>
+      </w:r>
+    </w:p>
+    <w:p>
+      <w:pPr>
+        <w:ind w:left="567"/>
+        <w:rPr>
+          <w:lang w:eastAsia="ja-JP"/>
+        </w:rPr>
+      </w:pPr>
+      <w:r>
+        <w:rPr>
+          <w:b/>
+          <w:lang w:eastAsia="ja-JP"/>
+        </w:rPr>
+        <w:t xml:space="preserve">3. </w:t>
+      </w:r>
+      <w:r>
+        <w:rPr>
+          <w:lang w:eastAsia="ja-JP"/>
+        </w:rPr>
+        <w:t>確認したい案件の行をクリックすると、詳細画面が表示されます。</w:t>
+      </w:r>
+    </w:p>
+    <w:p>
+      <w:pPr>
+        <w:pStyle w:val="21"/>
+      </w:pPr>
+      <w:r>
+        <w:t xml:space="preserve">6.2 </w:t>
+      </w:r>
+      <w:r>
+        <w:t>案件一覧のタブ</w:t>
+      </w:r>
+    </w:p>
+    <w:tbl>
+      <w:tblPr>
+        <w:tblStyle w:val="afe"/>
+        <w:tblW w:w="0" w:type="auto"/>
+        <w:jc w:val="center"/>
+        <w:tblLook w:val="04A0" w:firstRow="1" w:lastRow="0" w:firstColumn="1" w:lastColumn="0" w:noHBand="0" w:noVBand="1"/>
+      </w:tblPr>
+      <w:tblGrid>
+        <w:gridCol w:w="2268"/>
+        <w:gridCol w:w="6803"/>
+      </w:tblGrid>
+      <w:tr>
+        <w:trPr>
+          <w:jc w:val="center"/>
+        </w:trPr>
+        <w:tc>
+          <w:tcPr>
+            <w:tcW w:w="2268" w:type="dxa"/>
+            <w:shd w:val="clear" w:color="auto" w:fill="1A478A"/>
+          </w:tcPr>
+          <w:p>
+            <w:pPr>
+              <w:jc w:val="center"/>
+            </w:pPr>
+            <w:r>
+              <w:rPr>
+                <w:b/>
+                <w:color w:val="FFFFFF"/>
+                <w:sz w:val="19"/>
+              </w:rPr>
               <w:t>タブ名</w:t>
             </w:r>
           </w:p>
@@ -4852,14 +5459,12 @@
             <w:shd w:val="clear" w:color="auto" w:fill="F0F4FA"/>
           </w:tcPr>
           <w:p>
-            <w:proofErr w:type="spellStart"/>
             <w:r>
               <w:rPr>
                 <w:sz w:val="19"/>
               </w:rPr>
               <w:t>移行前</w:t>
             </w:r>
-            <w:proofErr w:type="spellEnd"/>
           </w:p>
         </w:tc>
         <w:tc>
@@ -4970,6 +5575,7 @@
         <w:rPr>
           <w:lang w:eastAsia="ja-JP"/>
         </w:rPr>
+        <w:lastRenderedPageBreak/>
         <w:t>・採用情報</w:t>
       </w:r>
     </w:p>
@@ -5006,51 +5612,8 @@
         <w:rPr>
           <w:lang w:eastAsia="ja-JP"/>
         </w:rPr>
-        <w:t>・ステータス（ドロップダウンは無効化されています）</w:t>
-      </w:r>
-    </w:p>
-    <w:p>
-      <w:pPr>
-        <w:ind w:left="850" w:hanging="283"/>
-        <w:rPr>
-          <w:lang w:eastAsia="ja-JP"/>
-        </w:rPr>
-      </w:pPr>
-      <w:r>
-        <w:rPr>
-          <w:lang w:eastAsia="ja-JP"/>
-        </w:rPr>
         <w:t>・右側の3つのチェックボックス（ログ確認、求人済、事前確認）は閲覧のみです</w:t>
       </w:r>
-    </w:p>
-    <w:p>
-      <w:pPr>
-        <w:ind w:left="567"/>
-        <w:rPr>
-          <w:lang w:eastAsia="ja-JP"/>
-        </w:rPr>
-      </w:pPr>
-      <w:r>
-        <w:rPr>
-          <w:lang w:eastAsia="ja-JP"/>
-        </w:rPr>
-        <w:t xml:space="preserve">💡 </w:t>
-      </w:r>
-      <w:r>
-        <w:rPr>
-          <w:color w:val="336699"/>
-          <w:sz w:val="19"/>
-          <w:lang w:eastAsia="ja-JP"/>
-        </w:rPr>
-        <w:t>ステータスの変更が必要な場合は、管理者に連絡してください。</w:t>
-      </w:r>
-    </w:p>
-    <w:p>
-      <w:pPr>
-        <w:rPr>
-          <w:lang w:eastAsia="ja-JP"/>
-        </w:rPr>
-      </w:pPr>
       <w:r>
         <w:rPr>
           <w:lang w:eastAsia="ja-JP"/>
@@ -5082,6 +5645,8 @@
     <w:p>
       <w:pPr>
         <w:rPr>
+          <w:b/>
+          <w:bCs/>
           <w:lang w:eastAsia="ja-JP"/>
         </w:rPr>
       </w:pPr>
@@ -5120,6 +5685,72 @@
           <w:lang w:eastAsia="ja-JP"/>
         </w:rPr>
         <w:t>1日2回のみ実行可能</w:t>
+      </w:r>
+      <w:r>
+        <w:rPr>
+          <w:b/>
+          <w:bCs/>
+          <w:color w:val="EE0000"/>
+          <w:lang w:eastAsia="ja-JP"/>
+        </w:rPr>
+        <w:br/>
+      </w:r>
+      <w:r>
+        <w:rPr>
+          <w:rFonts w:hint="eastAsia"/>
+          <w:b/>
+          <w:bCs/>
+          <w:lang w:eastAsia="ja-JP"/>
+        </w:rPr>
+        <w:t>処理が重く、貸与しているPCでは実行できない可能性があるのでエラーが出た場合は管理者に依頼してください。</w:t>
+      </w:r>
+    </w:p>
+    <w:p>
+      <w:pPr>
+        <w:rPr>
+          <w:rFonts w:hint="eastAsia"/>
+          <w:lang w:eastAsia="ja-JP"/>
+        </w:rPr>
+      </w:pPr>
+      <w:r>
+        <w:rPr>
+          <w:lang w:eastAsia="ja-JP"/>
+        </w:rPr>
+        <w:drawing>
+          <wp:inline distT="0" distB="0" distL="0" distR="0" wp14:anchorId="1F66CEB0" wp14:editId="41D6036E">
+            <wp:extent cx="5760720" cy="3430905"/>
+            <wp:effectExtent l="0" t="0" r="0" b="0"/>
+            <wp:docPr id="2064424654" name="図 1"/>
+            <wp:cNvGraphicFramePr>
+              <a:graphicFrameLocks xmlns:a="http://schemas.openxmlformats.org/drawingml/2006/main" noChangeAspect="1"/>
+            </wp:cNvGraphicFramePr>
+            <a:graphic xmlns:a="http://schemas.openxmlformats.org/drawingml/2006/main">
+              <a:graphicData uri="http://schemas.openxmlformats.org/drawingml/2006/picture">
+                <pic:pic xmlns:pic="http://schemas.openxmlformats.org/drawingml/2006/picture">
+                  <pic:nvPicPr>
+                    <pic:cNvPr id="2064424654" name=""/>
+                    <pic:cNvPicPr/>
+                  </pic:nvPicPr>
+                  <pic:blipFill>
+                    <a:blip r:embed="rId21"/>
+                    <a:stretch>
+                      <a:fillRect/>
+                    </a:stretch>
+                  </pic:blipFill>
+                  <pic:spPr>
+                    <a:xfrm>
+                      <a:off x="0" y="0"/>
+                      <a:ext cx="5760720" cy="3430905"/>
+                    </a:xfrm>
+                    <a:prstGeom prst="rect">
+                      <a:avLst/>
+                    </a:prstGeom>
+                  </pic:spPr>
+                </pic:pic>
+              </a:graphicData>
+            </a:graphic>
+          </wp:inline>
+        </w:drawing>
       </w:r>
     </w:p>
     <w:p>
@@ -5191,7 +5822,6 @@
             <w:pPr>
               <w:jc w:val="center"/>
             </w:pPr>
-            <w:proofErr w:type="spellStart"/>
             <w:r>
               <w:rPr>
                 <w:b/>
@@ -5200,7 +5830,6 @@
               </w:rPr>
               <w:t>評価項目</w:t>
             </w:r>
-            <w:proofErr w:type="spellEnd"/>
           </w:p>
         </w:tc>
         <w:tc>
@@ -5270,14 +5899,12 @@
             <w:shd w:val="clear" w:color="auto" w:fill="F0F4FA"/>
           </w:tcPr>
           <w:p>
-            <w:proofErr w:type="spellStart"/>
             <w:r>
               <w:rPr>
                 <w:sz w:val="19"/>
               </w:rPr>
               <w:t>明瞭さ</w:t>
             </w:r>
-            <w:proofErr w:type="spellEnd"/>
           </w:p>
         </w:tc>
         <w:tc>
@@ -5310,14 +5937,12 @@
             <w:tcW w:w="1984" w:type="dxa"/>
           </w:tcPr>
           <w:p>
-            <w:proofErr w:type="spellStart"/>
             <w:r>
               <w:rPr>
                 <w:sz w:val="19"/>
               </w:rPr>
               <w:t>ヒアリング</w:t>
             </w:r>
-            <w:proofErr w:type="spellEnd"/>
           </w:p>
         </w:tc>
         <w:tc>
@@ -5350,14 +5975,12 @@
             <w:shd w:val="clear" w:color="auto" w:fill="F0F4FA"/>
           </w:tcPr>
           <w:p>
-            <w:proofErr w:type="spellStart"/>
             <w:r>
               <w:rPr>
                 <w:sz w:val="19"/>
               </w:rPr>
               <w:t>切り返し</w:t>
             </w:r>
-            <w:proofErr w:type="spellEnd"/>
           </w:p>
         </w:tc>
         <w:tc>
@@ -5390,14 +6013,12 @@
             <w:tcW w:w="1984" w:type="dxa"/>
           </w:tcPr>
           <w:p>
-            <w:proofErr w:type="spellStart"/>
             <w:r>
               <w:rPr>
                 <w:sz w:val="19"/>
               </w:rPr>
               <w:t>クロージング</w:t>
             </w:r>
-            <w:proofErr w:type="spellEnd"/>
           </w:p>
         </w:tc>
         <w:tc>
@@ -5432,6 +6053,7 @@
         <w:rPr>
           <w:lang w:eastAsia="ja-JP"/>
         </w:rPr>
+        <w:lastRenderedPageBreak/>
         <w:t xml:space="preserve">7.2 </w:t>
       </w:r>
       <w:r>
@@ -5640,7 +6262,6 @@
         <w:rPr>
           <w:lang w:eastAsia="ja-JP"/>
         </w:rPr>
-        <w:lastRenderedPageBreak/>
         <w:t xml:space="preserve">7.4 </w:t>
       </w:r>
       <w:r>
@@ -5742,6 +6363,54 @@
     </w:p>
     <w:p>
       <w:pPr>
+        <w:rPr>
+          <w:rFonts w:hint="eastAsia"/>
+          <w:lang w:eastAsia="ja-JP"/>
+        </w:rPr>
+      </w:pPr>
+      <w:r>
+        <w:rPr>
+          <w:lang w:eastAsia="ja-JP"/>
+        </w:rPr>
+        <w:drawing>
+          <wp:inline distT="0" distB="0" distL="0" distR="0" wp14:anchorId="417BF26B" wp14:editId="58589896">
+            <wp:extent cx="5760720" cy="2765425"/>
+            <wp:effectExtent l="0" t="0" r="0" b="0"/>
+            <wp:docPr id="286919535" name="図 1"/>
+            <wp:cNvGraphicFramePr>
+              <a:graphicFrameLocks xmlns:a="http://schemas.openxmlformats.org/drawingml/2006/main" noChangeAspect="1"/>
+            </wp:cNvGraphicFramePr>
+            <a:graphic xmlns:a="http://schemas.openxmlformats.org/drawingml/2006/main">
+              <a:graphicData uri="http://schemas.openxmlformats.org/drawingml/2006/picture">
+                <pic:pic xmlns:pic="http://schemas.openxmlformats.org/drawingml/2006/picture">
+                  <pic:nvPicPr>
+                    <pic:cNvPr id="286919535" name=""/>
+                    <pic:cNvPicPr/>
+                  </pic:nvPicPr>
+                  <pic:blipFill>
+                    <a:blip r:embed="rId22"/>
+                    <a:stretch>
+                      <a:fillRect/>
+                    </a:stretch>
+                  </pic:blipFill>
+                  <pic:spPr>
+                    <a:xfrm>
+                      <a:off x="0" y="0"/>
+                      <a:ext cx="5760720" cy="2765425"/>
+                    </a:xfrm>
+                    <a:prstGeom prst="rect">
+                      <a:avLst/>
+                    </a:prstGeom>
+                  </pic:spPr>
+                </pic:pic>
+              </a:graphicData>
+            </a:graphic>
+          </wp:inline>
+        </w:drawing>
+      </w:r>
+    </w:p>
+    <w:p>
+      <w:pPr>
         <w:pStyle w:val="21"/>
         <w:rPr>
           <w:lang w:eastAsia="ja-JP"/>
@@ -5762,6 +6431,14 @@
     </w:p>
     <w:p>
       <w:pPr>
+        <w:rPr>
+          <w:rFonts w:hint="eastAsia"/>
+          <w:lang w:eastAsia="ja-JP"/>
+        </w:rPr>
+      </w:pPr>
+    </w:p>
+    <w:p>
+      <w:pPr>
         <w:ind w:left="567"/>
         <w:rPr>
           <w:lang w:eastAsia="ja-JP"/>
@@ -5930,6 +6607,7 @@
         <w:rPr>
           <w:lang w:eastAsia="ja-JP"/>
         </w:rPr>
+        <w:lastRenderedPageBreak/>
         <w:t xml:space="preserve">8.3 </w:t>
       </w:r>
       <w:r>
@@ -6085,6 +6763,54 @@
     </w:p>
     <w:p>
       <w:pPr>
+        <w:rPr>
+          <w:rFonts w:hint="eastAsia"/>
+          <w:lang w:eastAsia="ja-JP"/>
+        </w:rPr>
+      </w:pPr>
+      <w:r>
+        <w:rPr>
+          <w:lang w:eastAsia="ja-JP"/>
+        </w:rPr>
+        <w:drawing>
+          <wp:inline distT="0" distB="0" distL="0" distR="0" wp14:anchorId="75EA7D5C" wp14:editId="4F090CFF">
+            <wp:extent cx="5760720" cy="3463290"/>
+            <wp:effectExtent l="0" t="0" r="0" b="3810"/>
+            <wp:docPr id="243007757" name="図 1"/>
+            <wp:cNvGraphicFramePr>
+              <a:graphicFrameLocks xmlns:a="http://schemas.openxmlformats.org/drawingml/2006/main" noChangeAspect="1"/>
+            </wp:cNvGraphicFramePr>
+            <a:graphic xmlns:a="http://schemas.openxmlformats.org/drawingml/2006/main">
+              <a:graphicData uri="http://schemas.openxmlformats.org/drawingml/2006/picture">
+                <pic:pic xmlns:pic="http://schemas.openxmlformats.org/drawingml/2006/picture">
+                  <pic:nvPicPr>
+                    <pic:cNvPr id="243007757" name=""/>
+                    <pic:cNvPicPr/>
+                  </pic:nvPicPr>
+                  <pic:blipFill>
+                    <a:blip r:embed="rId23"/>
+                    <a:stretch>
+                      <a:fillRect/>
+                    </a:stretch>
+                  </pic:blipFill>
+                  <pic:spPr>
+                    <a:xfrm>
+                      <a:off x="0" y="0"/>
+                      <a:ext cx="5760720" cy="3463290"/>
+                    </a:xfrm>
+                    <a:prstGeom prst="rect">
+                      <a:avLst/>
+                    </a:prstGeom>
+                  </pic:spPr>
+                </pic:pic>
+              </a:graphicData>
+            </a:graphic>
+          </wp:inline>
+        </w:drawing>
+      </w:r>
+    </w:p>
+    <w:p>
+      <w:pPr>
         <w:pStyle w:val="21"/>
         <w:rPr>
           <w:lang w:eastAsia="ja-JP"/>
@@ -6204,21 +6930,7 @@
         <w:rPr>
           <w:lang w:eastAsia="ja-JP"/>
         </w:rPr>
-        <w:t>・Excel形式（.</w:t>
-      </w:r>
-      <w:proofErr w:type="spellStart"/>
-      <w:r>
-        <w:rPr>
-          <w:lang w:eastAsia="ja-JP"/>
-        </w:rPr>
-        <w:t>xls</w:t>
-      </w:r>
-      <w:proofErr w:type="spellEnd"/>
-      <w:r>
-        <w:rPr>
-          <w:lang w:eastAsia="ja-JP"/>
-        </w:rPr>
-        <w:t xml:space="preserve"> / .xlsx）</w:t>
+        <w:t>・Excel形式（.xls / .xlsx）</w:t>
       </w:r>
     </w:p>
     <w:p>
@@ -6308,6 +7020,7 @@
           <w:b/>
           <w:lang w:eastAsia="ja-JP"/>
         </w:rPr>
+        <w:lastRenderedPageBreak/>
         <w:t xml:space="preserve">2. </w:t>
       </w:r>
       <w:r>
@@ -6398,6 +7111,26 @@
           <w:lang w:eastAsia="ja-JP"/>
         </w:rPr>
         <w:t>「ピックアップ」ボタンをクリックすると、その企業がロックされ、架電画面に移動します。</w:t>
+      </w:r>
+    </w:p>
+    <w:p>
+      <w:pPr>
+        <w:ind w:left="567"/>
+        <w:rPr>
+          <w:rFonts w:hint="eastAsia"/>
+          <w:b/>
+          <w:color w:val="EE0000"/>
+          <w:lang w:eastAsia="ja-JP"/>
+        </w:rPr>
+      </w:pPr>
+      <w:r>
+        <w:rPr>
+          <w:rFonts w:hint="eastAsia"/>
+          <w:b/>
+          <w:color w:val="EE0000"/>
+          <w:lang w:eastAsia="ja-JP"/>
+        </w:rPr>
+        <w:t>※インポートしたリストについては自分リストに表示されます。</w:t>
       </w:r>
     </w:p>
     <w:p>
@@ -6639,7 +7372,6 @@
             <w:pPr>
               <w:jc w:val="center"/>
             </w:pPr>
-            <w:proofErr w:type="spellStart"/>
             <w:r>
               <w:rPr>
                 <w:b/>
@@ -6648,7 +7380,6 @@
               </w:rPr>
               <w:t>結果コード</w:t>
             </w:r>
-            <w:proofErr w:type="spellEnd"/>
           </w:p>
         </w:tc>
         <w:tc>
@@ -7134,7 +7865,6 @@
             <w:pPr>
               <w:jc w:val="center"/>
             </w:pPr>
-            <w:proofErr w:type="spellStart"/>
             <w:r>
               <w:rPr>
                 <w:b/>
@@ -7143,7 +7873,6 @@
               </w:rPr>
               <w:t>操作</w:t>
             </w:r>
-            <w:proofErr w:type="spellEnd"/>
           </w:p>
         </w:tc>
         <w:tc>
@@ -7301,21 +8030,7 @@
               <w:rPr>
                 <w:sz w:val="19"/>
               </w:rPr>
-              <w:t xml:space="preserve">F5 </w:t>
-            </w:r>
-            <w:proofErr w:type="spellStart"/>
-            <w:r>
-              <w:rPr>
-                <w:sz w:val="19"/>
-              </w:rPr>
-              <w:t>または</w:t>
-            </w:r>
-            <w:proofErr w:type="spellEnd"/>
-            <w:r>
-              <w:rPr>
-                <w:sz w:val="19"/>
-              </w:rPr>
-              <w:t xml:space="preserve"> Ctrl + R</w:t>
+              <w:t>F5 または Ctrl + R</w:t>
             </w:r>
           </w:p>
         </w:tc>
@@ -7469,14 +8184,12 @@
             <w:shd w:val="clear" w:color="auto" w:fill="F0F4FA"/>
           </w:tcPr>
           <w:p>
-            <w:proofErr w:type="spellStart"/>
             <w:r>
               <w:rPr>
                 <w:sz w:val="19"/>
               </w:rPr>
               <w:t>ログインできない</w:t>
             </w:r>
-            <w:proofErr w:type="spellEnd"/>
           </w:p>
         </w:tc>
         <w:tc>
@@ -7641,8 +8354,8 @@
       </w:pPr>
     </w:p>
     <w:sectPr>
-      <w:headerReference w:type="default" r:id="rId8"/>
-      <w:footerReference w:type="default" r:id="rId9"/>
+      <w:headerReference w:type="default" r:id="rId24"/>
+      <w:footerReference w:type="default" r:id="rId25"/>
       <w:pgSz w:w="11906" w:h="16838"/>
       <w:pgMar w:top="1417" w:right="1417" w:bottom="1417" w:left="1417" w:header="720" w:footer="720" w:gutter="0"/>
       <w:cols w:space="720"/>
@@ -7923,6 +8636,121 @@
       </w:pPr>
       <w:rPr>
         <w:rFonts w:ascii="Symbol" w:hAnsi="Symbol" w:hint="default"/>
+      </w:rPr>
+    </w:lvl>
+  </w:abstractNum>
+  <w:abstractNum w:abstractNumId="9" w15:restartNumberingAfterBreak="0">
+    <w:nsid w:val="5793767B"/>
+    <w:multiLevelType w:val="hybridMultilevel"/>
+    <w:tmpl w:val="EE387EE4"/>
+    <w:lvl w:ilvl="0" w:tplc="58FE7EE6">
+      <w:start w:val="3"/>
+      <w:numFmt w:val="bullet"/>
+      <w:lvlText w:val="※"/>
+      <w:lvlJc w:val="left"/>
+      <w:pPr>
+        <w:ind w:left="927" w:hanging="360"/>
+      </w:pPr>
+      <w:rPr>
+        <w:rFonts w:ascii="Yu Gothic" w:eastAsia="Yu Gothic" w:hAnsi="Yu Gothic" w:cstheme="minorBidi" w:hint="eastAsia"/>
+        <w:b/>
+        <w:bCs/>
+      </w:rPr>
+    </w:lvl>
+    <w:lvl w:ilvl="1" w:tplc="0409000B" w:tentative="1">
+      <w:start w:val="1"/>
+      <w:numFmt w:val="bullet"/>
+      <w:lvlText w:val=""/>
+      <w:lvlJc w:val="left"/>
+      <w:pPr>
+        <w:ind w:left="1447" w:hanging="440"/>
+      </w:pPr>
+      <w:rPr>
+        <w:rFonts w:ascii="Wingdings" w:hAnsi="Wingdings" w:hint="default"/>
+      </w:rPr>
+    </w:lvl>
+    <w:lvl w:ilvl="2" w:tplc="0409000D" w:tentative="1">
+      <w:start w:val="1"/>
+      <w:numFmt w:val="bullet"/>
+      <w:lvlText w:val=""/>
+      <w:lvlJc w:val="left"/>
+      <w:pPr>
+        <w:ind w:left="1887" w:hanging="440"/>
+      </w:pPr>
+      <w:rPr>
+        <w:rFonts w:ascii="Wingdings" w:hAnsi="Wingdings" w:hint="default"/>
+      </w:rPr>
+    </w:lvl>
+    <w:lvl w:ilvl="3" w:tplc="04090001" w:tentative="1">
+      <w:start w:val="1"/>
+      <w:numFmt w:val="bullet"/>
+      <w:lvlText w:val=""/>
+      <w:lvlJc w:val="left"/>
+      <w:pPr>
+        <w:ind w:left="2327" w:hanging="440"/>
+      </w:pPr>
+      <w:rPr>
+        <w:rFonts w:ascii="Wingdings" w:hAnsi="Wingdings" w:hint="default"/>
+      </w:rPr>
+    </w:lvl>
+    <w:lvl w:ilvl="4" w:tplc="0409000B" w:tentative="1">
+      <w:start w:val="1"/>
+      <w:numFmt w:val="bullet"/>
+      <w:lvlText w:val=""/>
+      <w:lvlJc w:val="left"/>
+      <w:pPr>
+        <w:ind w:left="2767" w:hanging="440"/>
+      </w:pPr>
+      <w:rPr>
+        <w:rFonts w:ascii="Wingdings" w:hAnsi="Wingdings" w:hint="default"/>
+      </w:rPr>
+    </w:lvl>
+    <w:lvl w:ilvl="5" w:tplc="0409000D" w:tentative="1">
+      <w:start w:val="1"/>
+      <w:numFmt w:val="bullet"/>
+      <w:lvlText w:val=""/>
+      <w:lvlJc w:val="left"/>
+      <w:pPr>
+        <w:ind w:left="3207" w:hanging="440"/>
+      </w:pPr>
+      <w:rPr>
+        <w:rFonts w:ascii="Wingdings" w:hAnsi="Wingdings" w:hint="default"/>
+      </w:rPr>
+    </w:lvl>
+    <w:lvl w:ilvl="6" w:tplc="04090001" w:tentative="1">
+      <w:start w:val="1"/>
+      <w:numFmt w:val="bullet"/>
+      <w:lvlText w:val=""/>
+      <w:lvlJc w:val="left"/>
+      <w:pPr>
+        <w:ind w:left="3647" w:hanging="440"/>
+      </w:pPr>
+      <w:rPr>
+        <w:rFonts w:ascii="Wingdings" w:hAnsi="Wingdings" w:hint="default"/>
+      </w:rPr>
+    </w:lvl>
+    <w:lvl w:ilvl="7" w:tplc="0409000B" w:tentative="1">
+      <w:start w:val="1"/>
+      <w:numFmt w:val="bullet"/>
+      <w:lvlText w:val=""/>
+      <w:lvlJc w:val="left"/>
+      <w:pPr>
+        <w:ind w:left="4087" w:hanging="440"/>
+      </w:pPr>
+      <w:rPr>
+        <w:rFonts w:ascii="Wingdings" w:hAnsi="Wingdings" w:hint="default"/>
+      </w:rPr>
+    </w:lvl>
+    <w:lvl w:ilvl="8" w:tplc="0409000D" w:tentative="1">
+      <w:start w:val="1"/>
+      <w:numFmt w:val="bullet"/>
+      <w:lvlText w:val=""/>
+      <w:lvlJc w:val="left"/>
+      <w:pPr>
+        <w:ind w:left="4527" w:hanging="440"/>
+      </w:pPr>
+      <w:rPr>
+        <w:rFonts w:ascii="Wingdings" w:hAnsi="Wingdings" w:hint="default"/>
       </w:rPr>
     </w:lvl>
   </w:abstractNum>
@@ -7952,6 +8780,9 @@
   </w:num>
   <w:num w:numId="9" w16cid:durableId="1601909396">
     <w:abstractNumId w:val="0"/>
+  </w:num>
+  <w:num w:numId="10" w16cid:durableId="819424558">
+    <w:abstractNumId w:val="9"/>
   </w:num>
 </w:numbering>
 </file>
@@ -8350,7 +9181,7 @@
       <w:spacing w:after="80" w:line="336" w:lineRule="auto"/>
     </w:pPr>
     <w:rPr>
-      <w:rFonts w:ascii="游ゴシック" w:eastAsia="游ゴシック" w:hAnsi="游ゴシック"/>
+      <w:rFonts w:ascii="Yu Gothic" w:eastAsia="Yu Gothic" w:hAnsi="Yu Gothic"/>
       <w:sz w:val="21"/>
     </w:rPr>
   </w:style>

</xml_diff>

<commit_message>
Add status sheet section (chapter 11) to operator manual
- Word (.docx): Section 11 added before appendix
- HTML: Section 11 with TOC entry, training table, notice/tip blocks
- Covers: sheet viewing, training progress (beginners), leader features

Co-Authored-By: Claude Opus 4.6 (1M context) <noreply@anthropic.com>
</commit_message>
<xml_diff>
--- a/docs/オペレーター操作マニュアル.docx
+++ b/docs/オペレーター操作マニュアル.docx
@@ -470,6 +470,341 @@
           <w:lang w:eastAsia="ja-JP"/>
         </w:rPr>
         <w:t>10.  メッセージ</w:t>
+      </w:r>
+    </w:p>
+    <w:p>
+      <w:r>
+        <w:rPr>
+          <w:rFonts w:ascii="Yu Gothic UI" w:hAnsi="Yu Gothic UI" w:eastAsia="Yu Gothic UI"/>
+          <w:color w:val="1F2A37"/>
+          <w:sz w:val="21"/>
+        </w:rPr>
+        <w:t>※ステータスシートの内容は管理者が作成・編集します。内容について質問がある場合は、管理者またはマネージャーに確認してください。</w:t>
+      </w:r>
+    </w:p>
+    <w:p/>
+    <w:p>
+      <w:r>
+        <w:rPr>
+          <w:rFonts w:ascii="Yu Gothic UI" w:hAnsi="Yu Gothic UI" w:eastAsia="Yu Gothic UI"/>
+          <w:color w:val="1F2A37"/>
+          <w:sz w:val="21"/>
+        </w:rPr>
+        <w:t>リーダーランクの方は、「自分のシート」と「全員のシート」を切り替えて、他のオペレーターのステータスシートも閲覧できます。画面上部のタブで切り替えてください。</w:t>
+      </w:r>
+    </w:p>
+    <w:p>
+      <w:pPr>
+        <w:pStyle w:val="21"/>
+      </w:pPr>
+      <w:r>
+        <w:rPr>
+          <w:rFonts w:ascii="Yu Gothic UI" w:hAnsi="Yu Gothic UI" w:eastAsia="Yu Gothic UI"/>
+          <w:b/>
+          <w:color w:val="2563EB"/>
+          <w:sz w:val="28"/>
+        </w:rPr>
+        <w:t>11.3 リーダーの方へ</w:t>
+      </w:r>
+    </w:p>
+    <w:p>
+      <w:r>
+        <w:rPr>
+          <w:rFonts w:ascii="Yu Gothic UI" w:hAnsi="Yu Gothic UI" w:eastAsia="Yu Gothic UI"/>
+          <w:color w:val="1F2A37"/>
+          <w:sz w:val="21"/>
+        </w:rPr>
+        <w:t>※研修の進捗管理は管理者が更新します。</w:t>
+      </w:r>
+    </w:p>
+    <w:p/>
+    <w:p>
+      <w:r>
+        <w:rPr>
+          <w:rFonts w:ascii="Yu Gothic UI" w:hAnsi="Yu Gothic UI" w:eastAsia="Yu Gothic UI"/>
+          <w:color w:val="1F2A37"/>
+          <w:sz w:val="21"/>
+        </w:rPr>
+        <w:t>7. 面談実施</w:t>
+      </w:r>
+    </w:p>
+    <w:p>
+      <w:r>
+        <w:rPr>
+          <w:rFonts w:ascii="Yu Gothic UI" w:hAnsi="Yu Gothic UI" w:eastAsia="Yu Gothic UI"/>
+          <w:color w:val="1F2A37"/>
+          <w:sz w:val="21"/>
+        </w:rPr>
+        <w:t>6. 改善点フィードバック</w:t>
+      </w:r>
+    </w:p>
+    <w:p>
+      <w:r>
+        <w:rPr>
+          <w:rFonts w:ascii="Yu Gothic UI" w:hAnsi="Yu Gothic UI" w:eastAsia="Yu Gothic UI"/>
+          <w:color w:val="1F2A37"/>
+          <w:sz w:val="21"/>
+        </w:rPr>
+        <w:t>5. 架電開始</w:t>
+      </w:r>
+    </w:p>
+    <w:p>
+      <w:r>
+        <w:rPr>
+          <w:rFonts w:ascii="Yu Gothic UI" w:hAnsi="Yu Gothic UI" w:eastAsia="Yu Gothic UI"/>
+          <w:color w:val="1F2A37"/>
+          <w:sz w:val="21"/>
+        </w:rPr>
+        <w:t>4. コールシステム説明</w:t>
+      </w:r>
+    </w:p>
+    <w:p>
+      <w:r>
+        <w:rPr>
+          <w:rFonts w:ascii="Yu Gothic UI" w:hAnsi="Yu Gothic UI" w:eastAsia="Yu Gothic UI"/>
+          <w:color w:val="1F2A37"/>
+          <w:sz w:val="21"/>
+        </w:rPr>
+        <w:t>3. ロープレ</w:t>
+      </w:r>
+    </w:p>
+    <w:p>
+      <w:r>
+        <w:rPr>
+          <w:rFonts w:ascii="Yu Gothic UI" w:hAnsi="Yu Gothic UI" w:eastAsia="Yu Gothic UI"/>
+          <w:color w:val="1F2A37"/>
+          <w:sz w:val="21"/>
+        </w:rPr>
+        <w:t>2. トークスクリプト読み込み</w:t>
+      </w:r>
+    </w:p>
+    <w:p>
+      <w:r>
+        <w:rPr>
+          <w:rFonts w:ascii="Yu Gothic UI" w:hAnsi="Yu Gothic UI" w:eastAsia="Yu Gothic UI"/>
+          <w:color w:val="1F2A37"/>
+          <w:sz w:val="21"/>
+        </w:rPr>
+        <w:t>1. 座学研修/サービス理解</w:t>
+      </w:r>
+    </w:p>
+    <w:p/>
+    <w:p>
+      <w:r>
+        <w:rPr>
+          <w:rFonts w:ascii="Yu Gothic UI" w:hAnsi="Yu Gothic UI" w:eastAsia="Yu Gothic UI"/>
+          <w:color w:val="1F2A37"/>
+          <w:sz w:val="21"/>
+        </w:rPr>
+        <w:t>初級ランクの方は、研修の進捗状況も表示されます。以下の研修項目の完了状況が確認できます：</w:t>
+      </w:r>
+    </w:p>
+    <w:p>
+      <w:pPr>
+        <w:pStyle w:val="21"/>
+      </w:pPr>
+      <w:r>
+        <w:rPr>
+          <w:rFonts w:ascii="Yu Gothic UI" w:hAnsi="Yu Gothic UI" w:eastAsia="Yu Gothic UI"/>
+          <w:b/>
+          <w:color w:val="2563EB"/>
+          <w:sz w:val="28"/>
+        </w:rPr>
+        <w:t>11.2 研修進捗（初級の方）</w:t>
+      </w:r>
+    </w:p>
+    <w:p>
+      <w:r>
+        <w:rPr>
+          <w:rFonts w:ascii="Yu Gothic UI" w:hAnsi="Yu Gothic UI" w:eastAsia="Yu Gothic UI"/>
+          <w:color w:val="1F2A37"/>
+          <w:sz w:val="21"/>
+        </w:rPr>
+        <w:t>・達成基準：どうなったら達成か</w:t>
+      </w:r>
+    </w:p>
+    <w:p>
+      <w:r>
+        <w:rPr>
+          <w:rFonts w:ascii="Yu Gothic UI" w:hAnsi="Yu Gothic UI" w:eastAsia="Yu Gothic UI"/>
+          <w:color w:val="1F2A37"/>
+          <w:sz w:val="21"/>
+        </w:rPr>
+        <w:t>・期限：いつまでに</w:t>
+      </w:r>
+    </w:p>
+    <w:p>
+      <w:r>
+        <w:rPr>
+          <w:rFonts w:ascii="Yu Gothic UI" w:hAnsi="Yu Gothic UI" w:eastAsia="Yu Gothic UI"/>
+          <w:color w:val="1F2A37"/>
+          <w:sz w:val="21"/>
+        </w:rPr>
+        <w:t>・理由：なぜこれをやるべきか</w:t>
+      </w:r>
+    </w:p>
+    <w:p>
+      <w:r>
+        <w:rPr>
+          <w:rFonts w:ascii="Yu Gothic UI" w:hAnsi="Yu Gothic UI" w:eastAsia="Yu Gothic UI"/>
+          <w:color w:val="1F2A37"/>
+          <w:sz w:val="21"/>
+        </w:rPr>
+        <w:t>・アクション内容：実際の架電で取り組むこと</w:t>
+      </w:r>
+    </w:p>
+    <w:p>
+      <w:r>
+        <w:rPr>
+          <w:rFonts w:ascii="Yu Gothic UI" w:hAnsi="Yu Gothic UI" w:eastAsia="Yu Gothic UI"/>
+          <w:color w:val="1F2A37"/>
+          <w:sz w:val="21"/>
+        </w:rPr>
+        <w:t>具体的に次にやるべきアクションが記載されています。各アクションには以下の情報があります：</w:t>
+      </w:r>
+    </w:p>
+    <w:p>
+      <w:r>
+        <w:rPr>
+          <w:rFonts w:ascii="Yu Gothic UI" w:hAnsi="Yu Gothic UI" w:eastAsia="Yu Gothic UI"/>
+          <w:b/>
+          <w:color w:val="1F2A37"/>
+          <w:sz w:val="21"/>
+        </w:rPr>
+        <w:t>3. ネクストステップ</w:t>
+      </w:r>
+    </w:p>
+    <w:p/>
+    <w:p>
+      <w:r>
+        <w:rPr>
+          <w:rFonts w:ascii="Yu Gothic UI" w:hAnsi="Yu Gothic UI" w:eastAsia="Yu Gothic UI"/>
+          <w:color w:val="1F2A37"/>
+          <w:sz w:val="21"/>
+        </w:rPr>
+        <w:t>・長期（3ヶ月以内）：3ヶ月後に目指す姿</w:t>
+      </w:r>
+    </w:p>
+    <w:p>
+      <w:r>
+        <w:rPr>
+          <w:rFonts w:ascii="Yu Gothic UI" w:hAnsi="Yu Gothic UI" w:eastAsia="Yu Gothic UI"/>
+          <w:color w:val="1F2A37"/>
+          <w:sz w:val="21"/>
+        </w:rPr>
+        <w:t>・中期（1ヶ月以内）：1ヶ月後に達成したい目標</w:t>
+      </w:r>
+    </w:p>
+    <w:p>
+      <w:r>
+        <w:rPr>
+          <w:rFonts w:ascii="Yu Gothic UI" w:hAnsi="Yu Gothic UI" w:eastAsia="Yu Gothic UI"/>
+          <w:color w:val="1F2A37"/>
+          <w:sz w:val="21"/>
+        </w:rPr>
+        <w:t>・短期（今週〜来週）：すぐに取り組むべき目標と方法</w:t>
+      </w:r>
+    </w:p>
+    <w:p>
+      <w:r>
+        <w:rPr>
+          <w:rFonts w:ascii="Yu Gothic UI" w:hAnsi="Yu Gothic UI" w:eastAsia="Yu Gothic UI"/>
+          <w:b/>
+          <w:color w:val="1F2A37"/>
+          <w:sz w:val="21"/>
+        </w:rPr>
+        <w:t>2. 育成プラン</w:t>
+      </w:r>
+    </w:p>
+    <w:p/>
+    <w:p>
+      <w:r>
+        <w:rPr>
+          <w:rFonts w:ascii="Yu Gothic UI" w:hAnsi="Yu Gothic UI" w:eastAsia="Yu Gothic UI"/>
+          <w:color w:val="1F2A37"/>
+          <w:sz w:val="21"/>
+        </w:rPr>
+        <w:t>・改善が必要な点：今後改善すべきポイントが具体的な根拠とともに記載されています</w:t>
+      </w:r>
+    </w:p>
+    <w:p>
+      <w:r>
+        <w:rPr>
+          <w:rFonts w:ascii="Yu Gothic UI" w:hAnsi="Yu Gothic UI" w:eastAsia="Yu Gothic UI"/>
+          <w:color w:val="1F2A37"/>
+          <w:sz w:val="21"/>
+        </w:rPr>
+        <w:t>・できていること：あなたの架電業務で評価されている点が具体的に記載されています</w:t>
+      </w:r>
+    </w:p>
+    <w:p>
+      <w:r>
+        <w:rPr>
+          <w:rFonts w:ascii="Yu Gothic UI" w:hAnsi="Yu Gothic UI" w:eastAsia="Yu Gothic UI"/>
+          <w:b/>
+          <w:color w:val="1F2A37"/>
+          <w:sz w:val="21"/>
+        </w:rPr>
+        <w:t>1. 現在の育成状況</w:t>
+      </w:r>
+    </w:p>
+    <w:p/>
+    <w:p>
+      <w:r>
+        <w:rPr>
+          <w:rFonts w:ascii="Yu Gothic UI" w:hAnsi="Yu Gothic UI" w:eastAsia="Yu Gothic UI"/>
+          <w:color w:val="1F2A37"/>
+          <w:sz w:val="21"/>
+        </w:rPr>
+        <w:t>ステータスシートが公開されている場合、以下の情報を確認できます：</w:t>
+      </w:r>
+    </w:p>
+    <w:p>
+      <w:pPr>
+        <w:pStyle w:val="21"/>
+      </w:pPr>
+      <w:r>
+        <w:rPr>
+          <w:rFonts w:ascii="Yu Gothic UI" w:hAnsi="Yu Gothic UI" w:eastAsia="Yu Gothic UI"/>
+          <w:b/>
+          <w:color w:val="2563EB"/>
+          <w:sz w:val="28"/>
+        </w:rPr>
+        <w:t>11.1 ステータスシートの確認</w:t>
+      </w:r>
+    </w:p>
+    <w:p>
+      <w:r>
+        <w:rPr>
+          <w:rFonts w:ascii="Yu Gothic UI" w:hAnsi="Yu Gothic UI" w:eastAsia="Yu Gothic UI"/>
+          <w:color w:val="1F2A37"/>
+          <w:sz w:val="21"/>
+        </w:rPr>
+        <w:t>サイドバーの「ステータスシート」をクリックしてアクセスします。</w:t>
+      </w:r>
+    </w:p>
+    <w:p>
+      <w:r>
+        <w:rPr>
+          <w:rFonts w:ascii="Yu Gothic UI" w:hAnsi="Yu Gothic UI" w:eastAsia="Yu Gothic UI"/>
+          <w:color w:val="1F2A37"/>
+          <w:sz w:val="21"/>
+        </w:rPr>
+        <w:t>ステータスシートは、管理者が作成したあなたの育成状況・育成プラン・ネクストステップを確認できる機能です。</w:t>
+      </w:r>
+    </w:p>
+    <w:p>
+      <w:pPr>
+        <w:pStyle w:val="1"/>
+      </w:pPr>
+      <w:r>
+        <w:rPr>
+          <w:rFonts w:ascii="Yu Gothic UI" w:hAnsi="Yu Gothic UI" w:eastAsia="Yu Gothic UI"/>
+          <w:b/>
+          <w:color w:val="1E40AF"/>
+          <w:sz w:val="36"/>
+        </w:rPr>
+        <w:t>11. ステータスシート</w:t>
       </w:r>
     </w:p>
     <w:p>

</xml_diff>